<commit_message>
80% completa da Documentção
</commit_message>
<xml_diff>
--- a/Documentação/Documentação Mainteer.docx
+++ b/Documentação/Documentação Mainteer.docx
@@ -11121,6 +11121,7 @@
                 <w:rFonts w:ascii="Arial" w:hAnsi="Arial" w:cs="Arial"/>
                 <w:sz w:val="18"/>
                 <w:szCs w:val="18"/>
+                <w:lang w:val="pt-BR"/>
               </w:rPr>
             </w:pPr>
             <w:r>
@@ -11129,6 +11130,7 @@
                 <w:b/>
                 <w:sz w:val="18"/>
                 <w:szCs w:val="18"/>
+                <w:lang w:val="pt-BR"/>
               </w:rPr>
               <w:t>Restrições de Domínio(PK, FK, NOT NULL, AUTO_INCREMENT)</w:t>
             </w:r>
@@ -11936,13 +11938,15 @@
                 <w:rFonts w:ascii="Arial" w:hAnsi="Arial" w:cs="Arial"/>
                 <w:sz w:val="18"/>
                 <w:szCs w:val="18"/>
-              </w:rPr>
-            </w:pPr>
-            <w:r>
-              <w:rPr>
-                <w:rFonts w:ascii="Arial" w:hAnsi="Arial" w:cs="Arial"/>
-                <w:sz w:val="18"/>
-                <w:szCs w:val="18"/>
+                <w:lang w:val="pt-BR"/>
+              </w:rPr>
+            </w:pPr>
+            <w:r>
+              <w:rPr>
+                <w:rFonts w:ascii="Arial" w:hAnsi="Arial" w:cs="Arial"/>
+                <w:sz w:val="18"/>
+                <w:szCs w:val="18"/>
+                <w:lang w:val="pt-BR"/>
               </w:rPr>
               <w:t>Numero da casa do Cliente</w:t>
             </w:r>
@@ -12545,13 +12549,15 @@
                 <w:rFonts w:ascii="Arial" w:hAnsi="Arial" w:cs="Arial"/>
                 <w:sz w:val="18"/>
                 <w:szCs w:val="18"/>
-              </w:rPr>
-            </w:pPr>
-            <w:r>
-              <w:rPr>
-                <w:rFonts w:ascii="Arial" w:hAnsi="Arial" w:cs="Arial"/>
-                <w:sz w:val="18"/>
-                <w:szCs w:val="18"/>
+                <w:lang w:val="pt-BR"/>
+              </w:rPr>
+            </w:pPr>
+            <w:r>
+              <w:rPr>
+                <w:rFonts w:ascii="Arial" w:hAnsi="Arial" w:cs="Arial"/>
+                <w:sz w:val="18"/>
+                <w:szCs w:val="18"/>
+                <w:lang w:val="pt-BR"/>
               </w:rPr>
               <w:t>Data do cadastro do Cliente</w:t>
             </w:r>
@@ -13121,13 +13127,15 @@
                 <w:rFonts w:ascii="Arial" w:hAnsi="Arial" w:cs="Arial"/>
                 <w:sz w:val="18"/>
                 <w:szCs w:val="18"/>
-              </w:rPr>
-            </w:pPr>
-            <w:r>
-              <w:rPr>
-                <w:rFonts w:ascii="Arial" w:hAnsi="Arial" w:cs="Arial"/>
-                <w:sz w:val="18"/>
-                <w:szCs w:val="18"/>
+                <w:lang w:val="pt-BR"/>
+              </w:rPr>
+            </w:pPr>
+            <w:r>
+              <w:rPr>
+                <w:rFonts w:ascii="Arial" w:hAnsi="Arial" w:cs="Arial"/>
+                <w:sz w:val="18"/>
+                <w:szCs w:val="18"/>
+                <w:lang w:val="pt-BR"/>
               </w:rPr>
               <w:t>Armazenará informações das Motos dos Clientes</w:t>
             </w:r>
@@ -13207,13 +13215,15 @@
                 <w:rFonts w:ascii="Arial" w:hAnsi="Arial" w:cs="Arial"/>
                 <w:sz w:val="18"/>
                 <w:szCs w:val="18"/>
-              </w:rPr>
-            </w:pPr>
-            <w:r>
-              <w:rPr>
-                <w:rFonts w:ascii="Arial" w:hAnsi="Arial" w:cs="Arial"/>
-                <w:sz w:val="18"/>
-                <w:szCs w:val="18"/>
+                <w:lang w:val="pt-BR"/>
+              </w:rPr>
+            </w:pPr>
+            <w:r>
+              <w:rPr>
+                <w:rFonts w:ascii="Arial" w:hAnsi="Arial" w:cs="Arial"/>
+                <w:sz w:val="18"/>
+                <w:szCs w:val="18"/>
+                <w:lang w:val="pt-BR"/>
               </w:rPr>
               <w:t>Irá conter FK Marca, Cor e Cliente</w:t>
             </w:r>
@@ -13242,6 +13252,7 @@
                 <w:rFonts w:ascii="Arial" w:hAnsi="Arial" w:cs="Arial"/>
                 <w:sz w:val="18"/>
                 <w:szCs w:val="18"/>
+                <w:lang w:val="pt-BR"/>
               </w:rPr>
             </w:pPr>
           </w:p>
@@ -13426,6 +13437,7 @@
                 <w:rFonts w:ascii="Arial" w:hAnsi="Arial" w:cs="Arial"/>
                 <w:sz w:val="18"/>
                 <w:szCs w:val="18"/>
+                <w:lang w:val="pt-BR"/>
               </w:rPr>
             </w:pPr>
             <w:r>
@@ -13434,6 +13446,7 @@
                 <w:b/>
                 <w:sz w:val="18"/>
                 <w:szCs w:val="18"/>
+                <w:lang w:val="pt-BR"/>
               </w:rPr>
               <w:t>Restrições de Domínio(PK, FK, NOT NULL,  AUTO_INCREMENT)</w:t>
             </w:r>
@@ -14230,13 +14243,15 @@
                 <w:rFonts w:ascii="Arial" w:hAnsi="Arial" w:cs="Arial"/>
                 <w:sz w:val="18"/>
                 <w:szCs w:val="18"/>
-              </w:rPr>
-            </w:pPr>
-            <w:r>
-              <w:rPr>
-                <w:rFonts w:ascii="Arial" w:hAnsi="Arial" w:cs="Arial"/>
-                <w:sz w:val="18"/>
-                <w:szCs w:val="18"/>
+                <w:lang w:val="pt-BR"/>
+              </w:rPr>
+            </w:pPr>
+            <w:r>
+              <w:rPr>
+                <w:rFonts w:ascii="Arial" w:hAnsi="Arial" w:cs="Arial"/>
+                <w:sz w:val="18"/>
+                <w:szCs w:val="18"/>
+                <w:lang w:val="pt-BR"/>
               </w:rPr>
               <w:t>Chave estrangeira referenciando o código da tabela de Cliente</w:t>
             </w:r>
@@ -14378,13 +14393,15 @@
                 <w:rFonts w:ascii="Arial" w:hAnsi="Arial" w:cs="Arial"/>
                 <w:sz w:val="18"/>
                 <w:szCs w:val="18"/>
-              </w:rPr>
-            </w:pPr>
-            <w:r>
-              <w:rPr>
-                <w:rFonts w:ascii="Arial" w:hAnsi="Arial" w:cs="Arial"/>
-                <w:sz w:val="18"/>
-                <w:szCs w:val="18"/>
+                <w:lang w:val="pt-BR"/>
+              </w:rPr>
+            </w:pPr>
+            <w:r>
+              <w:rPr>
+                <w:rFonts w:ascii="Arial" w:hAnsi="Arial" w:cs="Arial"/>
+                <w:sz w:val="18"/>
+                <w:szCs w:val="18"/>
+                <w:lang w:val="pt-BR"/>
               </w:rPr>
               <w:t>Chave estrangeira referenciando o código da tabela de Modelo</w:t>
             </w:r>
@@ -14526,13 +14543,15 @@
                 <w:rFonts w:ascii="Arial" w:hAnsi="Arial" w:cs="Arial"/>
                 <w:sz w:val="18"/>
                 <w:szCs w:val="18"/>
-              </w:rPr>
-            </w:pPr>
-            <w:r>
-              <w:rPr>
-                <w:rFonts w:ascii="Arial" w:hAnsi="Arial" w:cs="Arial"/>
-                <w:sz w:val="18"/>
-                <w:szCs w:val="18"/>
+                <w:lang w:val="pt-BR"/>
+              </w:rPr>
+            </w:pPr>
+            <w:r>
+              <w:rPr>
+                <w:rFonts w:ascii="Arial" w:hAnsi="Arial" w:cs="Arial"/>
+                <w:sz w:val="18"/>
+                <w:szCs w:val="18"/>
+                <w:lang w:val="pt-BR"/>
               </w:rPr>
               <w:t>Chave estrangeira referenciando o código da tabela de Cor</w:t>
             </w:r>
@@ -15079,6 +15098,7 @@
               <w:jc w:val="center"/>
               <w:rPr>
                 <w:rFonts w:ascii="Arial" w:hAnsi="Arial" w:cs="Arial"/>
+                <w:lang w:val="pt-BR"/>
               </w:rPr>
             </w:pPr>
             <w:r>
@@ -15086,6 +15106,7 @@
                 <w:rFonts w:ascii="Arial" w:hAnsi="Arial" w:cs="Arial"/>
                 <w:b/>
                 <w:sz w:val="18"/>
+                <w:lang w:val="pt-BR"/>
               </w:rPr>
               <w:t>Restrições de Domínio(PK, FK, NOT NULL, AUTO_INCREMENT)</w:t>
             </w:r>
@@ -15803,6 +15824,7 @@
               <w:jc w:val="center"/>
               <w:rPr>
                 <w:rFonts w:ascii="Arial" w:hAnsi="Arial" w:cs="Arial"/>
+                <w:lang w:val="pt-BR"/>
               </w:rPr>
             </w:pPr>
             <w:r>
@@ -15810,6 +15832,7 @@
                 <w:rFonts w:ascii="Arial" w:hAnsi="Arial" w:cs="Arial"/>
                 <w:b/>
                 <w:sz w:val="18"/>
+                <w:lang w:val="pt-BR"/>
               </w:rPr>
               <w:t>Restrições de Domínio(PK, FK, NOT NULL, AUTO_INCREMENT)</w:t>
             </w:r>
@@ -16325,12 +16348,14 @@
               <w:ind w:left="1507"/>
               <w:rPr>
                 <w:rFonts w:ascii="Arial" w:hAnsi="Arial" w:cs="Arial"/>
-              </w:rPr>
-            </w:pPr>
-            <w:r>
-              <w:rPr>
-                <w:rFonts w:ascii="Arial" w:hAnsi="Arial" w:cs="Arial"/>
-                <w:sz w:val="18"/>
+                <w:lang w:val="pt-BR"/>
+              </w:rPr>
+            </w:pPr>
+            <w:r>
+              <w:rPr>
+                <w:rFonts w:ascii="Arial" w:hAnsi="Arial" w:cs="Arial"/>
+                <w:sz w:val="18"/>
+                <w:lang w:val="pt-BR"/>
               </w:rPr>
               <w:t>Possui FK da tabela Marca</w:t>
             </w:r>
@@ -16356,6 +16381,7 @@
             <w:pPr>
               <w:rPr>
                 <w:rFonts w:ascii="Arial" w:hAnsi="Arial" w:cs="Arial"/>
+                <w:lang w:val="pt-BR"/>
               </w:rPr>
             </w:pPr>
           </w:p>
@@ -16375,6 +16401,7 @@
             <w:pPr>
               <w:rPr>
                 <w:rFonts w:ascii="Arial" w:hAnsi="Arial" w:cs="Arial"/>
+                <w:lang w:val="pt-BR"/>
               </w:rPr>
             </w:pPr>
           </w:p>
@@ -16543,6 +16570,7 @@
               <w:jc w:val="center"/>
               <w:rPr>
                 <w:rFonts w:ascii="Arial" w:hAnsi="Arial" w:cs="Arial"/>
+                <w:lang w:val="pt-BR"/>
               </w:rPr>
             </w:pPr>
             <w:r>
@@ -16550,6 +16578,7 @@
                 <w:rFonts w:ascii="Arial" w:hAnsi="Arial" w:cs="Arial"/>
                 <w:b/>
                 <w:sz w:val="18"/>
+                <w:lang w:val="pt-BR"/>
               </w:rPr>
               <w:t>Restrições de Domínio(PK, FK, NOT NULL, AUTO_INCREMENT)</w:t>
             </w:r>
@@ -16865,12 +16894,14 @@
               <w:jc w:val="center"/>
               <w:rPr>
                 <w:rFonts w:ascii="Arial" w:hAnsi="Arial" w:cs="Arial"/>
-              </w:rPr>
-            </w:pPr>
-            <w:r>
-              <w:rPr>
-                <w:rFonts w:ascii="Arial" w:hAnsi="Arial" w:cs="Arial"/>
-                <w:sz w:val="18"/>
+                <w:lang w:val="pt-BR"/>
+              </w:rPr>
+            </w:pPr>
+            <w:r>
+              <w:rPr>
+                <w:rFonts w:ascii="Arial" w:hAnsi="Arial" w:cs="Arial"/>
+                <w:sz w:val="18"/>
+                <w:lang w:val="pt-BR"/>
               </w:rPr>
               <w:t>Chave estrangeira referenciando o código da tabela de Marca</w:t>
             </w:r>
@@ -17144,13 +17175,15 @@
                 <w:rFonts w:ascii="Arial" w:hAnsi="Arial" w:cs="Arial"/>
                 <w:sz w:val="18"/>
                 <w:szCs w:val="18"/>
-              </w:rPr>
-            </w:pPr>
-            <w:r>
-              <w:rPr>
-                <w:rFonts w:ascii="Arial" w:hAnsi="Arial" w:cs="Arial"/>
-                <w:sz w:val="18"/>
-                <w:szCs w:val="18"/>
+                <w:lang w:val="pt-BR"/>
+              </w:rPr>
+            </w:pPr>
+            <w:r>
+              <w:rPr>
+                <w:rFonts w:ascii="Arial" w:hAnsi="Arial" w:cs="Arial"/>
+                <w:sz w:val="18"/>
+                <w:szCs w:val="18"/>
+                <w:lang w:val="pt-BR"/>
               </w:rPr>
               <w:t>Armazenará os dados dos Funcionários</w:t>
             </w:r>
@@ -17440,6 +17473,7 @@
                 <w:rFonts w:ascii="Arial" w:hAnsi="Arial" w:cs="Arial"/>
                 <w:sz w:val="18"/>
                 <w:szCs w:val="18"/>
+                <w:lang w:val="pt-BR"/>
               </w:rPr>
             </w:pPr>
             <w:r>
@@ -17448,6 +17482,7 @@
                 <w:b/>
                 <w:sz w:val="18"/>
                 <w:szCs w:val="18"/>
+                <w:lang w:val="pt-BR"/>
               </w:rPr>
               <w:t>Restrições de Domínio(PK, FK, NOT NULL, AUTO_INCREMENT)</w:t>
             </w:r>
@@ -18396,13 +18431,15 @@
                 <w:rFonts w:ascii="Arial" w:hAnsi="Arial" w:cs="Arial"/>
                 <w:sz w:val="18"/>
                 <w:szCs w:val="18"/>
-              </w:rPr>
-            </w:pPr>
-            <w:r>
-              <w:rPr>
-                <w:rFonts w:ascii="Arial" w:hAnsi="Arial" w:cs="Arial"/>
-                <w:sz w:val="18"/>
-                <w:szCs w:val="18"/>
+                <w:lang w:val="pt-BR"/>
+              </w:rPr>
+            </w:pPr>
+            <w:r>
+              <w:rPr>
+                <w:rFonts w:ascii="Arial" w:hAnsi="Arial" w:cs="Arial"/>
+                <w:sz w:val="18"/>
+                <w:szCs w:val="18"/>
+                <w:lang w:val="pt-BR"/>
               </w:rPr>
               <w:t>User necessário para acessar no sistema</w:t>
             </w:r>
@@ -18707,13 +18744,15 @@
                 <w:rFonts w:ascii="Arial" w:hAnsi="Arial" w:cs="Arial"/>
                 <w:sz w:val="18"/>
                 <w:szCs w:val="18"/>
-              </w:rPr>
-            </w:pPr>
-            <w:r>
-              <w:rPr>
-                <w:rFonts w:ascii="Arial" w:hAnsi="Arial" w:cs="Arial"/>
-                <w:sz w:val="18"/>
-                <w:szCs w:val="18"/>
+                <w:lang w:val="pt-BR"/>
+              </w:rPr>
+            </w:pPr>
+            <w:r>
+              <w:rPr>
+                <w:rFonts w:ascii="Arial" w:hAnsi="Arial" w:cs="Arial"/>
+                <w:sz w:val="18"/>
+                <w:szCs w:val="18"/>
+                <w:lang w:val="pt-BR"/>
               </w:rPr>
               <w:t>Senha necessário para acessar o sistema</w:t>
             </w:r>
@@ -18952,13 +18991,15 @@
                 <w:rFonts w:ascii="Arial" w:hAnsi="Arial" w:cs="Arial"/>
                 <w:sz w:val="18"/>
                 <w:szCs w:val="18"/>
-              </w:rPr>
-            </w:pPr>
-            <w:r>
-              <w:rPr>
-                <w:rFonts w:ascii="Arial" w:hAnsi="Arial" w:cs="Arial"/>
-                <w:sz w:val="18"/>
-                <w:szCs w:val="18"/>
+                <w:lang w:val="pt-BR"/>
+              </w:rPr>
+            </w:pPr>
+            <w:r>
+              <w:rPr>
+                <w:rFonts w:ascii="Arial" w:hAnsi="Arial" w:cs="Arial"/>
+                <w:sz w:val="18"/>
+                <w:szCs w:val="18"/>
+                <w:lang w:val="pt-BR"/>
               </w:rPr>
               <w:t>Armazenará informações dos agendamentos de Serviço</w:t>
             </w:r>
@@ -19018,13 +19059,15 @@
                 <w:rFonts w:ascii="Arial" w:hAnsi="Arial" w:cs="Arial"/>
                 <w:sz w:val="18"/>
                 <w:szCs w:val="18"/>
-              </w:rPr>
-            </w:pPr>
-            <w:r>
-              <w:rPr>
-                <w:rFonts w:ascii="Arial" w:hAnsi="Arial" w:cs="Arial"/>
-                <w:sz w:val="18"/>
-                <w:szCs w:val="18"/>
+                <w:lang w:val="pt-BR"/>
+              </w:rPr>
+            </w:pPr>
+            <w:r>
+              <w:rPr>
+                <w:rFonts w:ascii="Arial" w:hAnsi="Arial" w:cs="Arial"/>
+                <w:sz w:val="18"/>
+                <w:szCs w:val="18"/>
+                <w:lang w:val="pt-BR"/>
               </w:rPr>
               <w:t>Possui FK do Funcionário e Moto</w:t>
             </w:r>
@@ -19219,6 +19262,7 @@
                 <w:rFonts w:ascii="Arial" w:hAnsi="Arial" w:cs="Arial"/>
                 <w:sz w:val="18"/>
                 <w:szCs w:val="18"/>
+                <w:lang w:val="pt-BR"/>
               </w:rPr>
             </w:pPr>
             <w:r>
@@ -19227,6 +19271,7 @@
                 <w:b/>
                 <w:sz w:val="18"/>
                 <w:szCs w:val="18"/>
+                <w:lang w:val="pt-BR"/>
               </w:rPr>
               <w:t>Restrições de Domínio(PK, FK, NOT NULL, AUTO_INCREMENT)</w:t>
             </w:r>
@@ -19722,13 +19767,15 @@
                 <w:rFonts w:ascii="Arial" w:hAnsi="Arial" w:cs="Arial"/>
                 <w:sz w:val="18"/>
                 <w:szCs w:val="18"/>
-              </w:rPr>
-            </w:pPr>
-            <w:r>
-              <w:rPr>
-                <w:rFonts w:ascii="Arial" w:hAnsi="Arial" w:cs="Arial"/>
-                <w:sz w:val="18"/>
-                <w:szCs w:val="18"/>
+                <w:lang w:val="pt-BR"/>
+              </w:rPr>
+            </w:pPr>
+            <w:r>
+              <w:rPr>
+                <w:rFonts w:ascii="Arial" w:hAnsi="Arial" w:cs="Arial"/>
+                <w:sz w:val="18"/>
+                <w:szCs w:val="18"/>
+                <w:lang w:val="pt-BR"/>
               </w:rPr>
               <w:t>Status do Agendamento(Agendado, Cancelado, Finalizado)</w:t>
             </w:r>
@@ -19865,13 +19912,15 @@
                 <w:rFonts w:ascii="Arial" w:hAnsi="Arial" w:cs="Arial"/>
                 <w:sz w:val="18"/>
                 <w:szCs w:val="18"/>
-              </w:rPr>
-            </w:pPr>
-            <w:r>
-              <w:rPr>
-                <w:rFonts w:ascii="Arial" w:hAnsi="Arial" w:cs="Arial"/>
-                <w:sz w:val="18"/>
-                <w:szCs w:val="18"/>
+                <w:lang w:val="pt-BR"/>
+              </w:rPr>
+            </w:pPr>
+            <w:r>
+              <w:rPr>
+                <w:rFonts w:ascii="Arial" w:hAnsi="Arial" w:cs="Arial"/>
+                <w:sz w:val="18"/>
+                <w:szCs w:val="18"/>
+                <w:lang w:val="pt-BR"/>
               </w:rPr>
               <w:t>Chave estrangeira referenciando o código da tabela de Funcionário</w:t>
             </w:r>
@@ -20011,13 +20060,15 @@
                 <w:rFonts w:ascii="Arial" w:hAnsi="Arial" w:cs="Arial"/>
                 <w:sz w:val="18"/>
                 <w:szCs w:val="18"/>
-              </w:rPr>
-            </w:pPr>
-            <w:r>
-              <w:rPr>
-                <w:rFonts w:ascii="Arial" w:hAnsi="Arial" w:cs="Arial"/>
-                <w:sz w:val="18"/>
-                <w:szCs w:val="18"/>
+                <w:lang w:val="pt-BR"/>
+              </w:rPr>
+            </w:pPr>
+            <w:r>
+              <w:rPr>
+                <w:rFonts w:ascii="Arial" w:hAnsi="Arial" w:cs="Arial"/>
+                <w:sz w:val="18"/>
+                <w:szCs w:val="18"/>
+                <w:lang w:val="pt-BR"/>
               </w:rPr>
               <w:t>Chave estrangeira referenciando o código da tabela de Moto</w:t>
             </w:r>
@@ -20273,13 +20324,15 @@
                 <w:rFonts w:ascii="Arial" w:hAnsi="Arial" w:cs="Arial"/>
                 <w:sz w:val="18"/>
                 <w:szCs w:val="18"/>
-              </w:rPr>
-            </w:pPr>
-            <w:r>
-              <w:rPr>
-                <w:rFonts w:ascii="Arial" w:hAnsi="Arial" w:cs="Arial"/>
-                <w:sz w:val="18"/>
-                <w:szCs w:val="18"/>
+                <w:lang w:val="pt-BR"/>
+              </w:rPr>
+            </w:pPr>
+            <w:r>
+              <w:rPr>
+                <w:rFonts w:ascii="Arial" w:hAnsi="Arial" w:cs="Arial"/>
+                <w:sz w:val="18"/>
+                <w:szCs w:val="18"/>
+                <w:lang w:val="pt-BR"/>
               </w:rPr>
               <w:t>Armazenará informações das ordens de serviço</w:t>
             </w:r>
@@ -20340,13 +20393,15 @@
                 <w:rFonts w:ascii="Arial" w:hAnsi="Arial" w:cs="Arial"/>
                 <w:sz w:val="18"/>
                 <w:szCs w:val="18"/>
-              </w:rPr>
-            </w:pPr>
-            <w:r>
-              <w:rPr>
-                <w:rFonts w:ascii="Arial" w:hAnsi="Arial" w:cs="Arial"/>
-                <w:sz w:val="18"/>
-                <w:szCs w:val="18"/>
+                <w:lang w:val="pt-BR"/>
+              </w:rPr>
+            </w:pPr>
+            <w:r>
+              <w:rPr>
+                <w:rFonts w:ascii="Arial" w:hAnsi="Arial" w:cs="Arial"/>
+                <w:sz w:val="18"/>
+                <w:szCs w:val="18"/>
+                <w:lang w:val="pt-BR"/>
               </w:rPr>
               <w:t>Possui FK Funcionario e Moto</w:t>
             </w:r>
@@ -20539,6 +20594,7 @@
                 <w:rFonts w:ascii="Arial" w:hAnsi="Arial" w:cs="Arial"/>
                 <w:sz w:val="18"/>
                 <w:szCs w:val="18"/>
+                <w:lang w:val="pt-BR"/>
               </w:rPr>
             </w:pPr>
             <w:r>
@@ -20547,6 +20603,7 @@
                 <w:b/>
                 <w:sz w:val="18"/>
                 <w:szCs w:val="18"/>
+                <w:lang w:val="pt-BR"/>
               </w:rPr>
               <w:t>Restrições de Domínio(PK, FK, NOT NULL, AUTO_INCREMENT)</w:t>
             </w:r>
@@ -20749,13 +20806,15 @@
                 <w:rFonts w:ascii="Arial" w:hAnsi="Arial" w:cs="Arial"/>
                 <w:sz w:val="18"/>
                 <w:szCs w:val="18"/>
-              </w:rPr>
-            </w:pPr>
-            <w:r>
-              <w:rPr>
-                <w:rFonts w:ascii="Arial" w:hAnsi="Arial" w:cs="Arial"/>
-                <w:sz w:val="18"/>
-                <w:szCs w:val="18"/>
+                <w:lang w:val="pt-BR"/>
+              </w:rPr>
+            </w:pPr>
+            <w:r>
+              <w:rPr>
+                <w:rFonts w:ascii="Arial" w:hAnsi="Arial" w:cs="Arial"/>
+                <w:sz w:val="18"/>
+                <w:szCs w:val="18"/>
+                <w:lang w:val="pt-BR"/>
               </w:rPr>
               <w:t>Data Abertura Ordem de Serviço</w:t>
             </w:r>
@@ -20893,13 +20952,15 @@
                 <w:rFonts w:ascii="Arial" w:hAnsi="Arial" w:cs="Arial"/>
                 <w:sz w:val="18"/>
                 <w:szCs w:val="18"/>
-              </w:rPr>
-            </w:pPr>
-            <w:r>
-              <w:rPr>
-                <w:rFonts w:ascii="Arial" w:hAnsi="Arial" w:cs="Arial"/>
-                <w:sz w:val="18"/>
-                <w:szCs w:val="18"/>
+                <w:lang w:val="pt-BR"/>
+              </w:rPr>
+            </w:pPr>
+            <w:r>
+              <w:rPr>
+                <w:rFonts w:ascii="Arial" w:hAnsi="Arial" w:cs="Arial"/>
+                <w:sz w:val="18"/>
+                <w:szCs w:val="18"/>
+                <w:lang w:val="pt-BR"/>
               </w:rPr>
               <w:t>Data Fechamento Ordem de Serviço</w:t>
             </w:r>
@@ -21027,13 +21088,15 @@
                 <w:rFonts w:ascii="Arial" w:hAnsi="Arial" w:cs="Arial"/>
                 <w:sz w:val="18"/>
                 <w:szCs w:val="18"/>
-              </w:rPr>
-            </w:pPr>
-            <w:r>
-              <w:rPr>
-                <w:rFonts w:ascii="Arial" w:hAnsi="Arial" w:cs="Arial"/>
-                <w:sz w:val="18"/>
-                <w:szCs w:val="18"/>
+                <w:lang w:val="pt-BR"/>
+              </w:rPr>
+            </w:pPr>
+            <w:r>
+              <w:rPr>
+                <w:rFonts w:ascii="Arial" w:hAnsi="Arial" w:cs="Arial"/>
+                <w:sz w:val="18"/>
+                <w:szCs w:val="18"/>
+                <w:lang w:val="pt-BR"/>
               </w:rPr>
               <w:t>Serviço realizado na ordem (Orçamento)</w:t>
             </w:r>
@@ -21318,13 +21381,15 @@
                 <w:rFonts w:ascii="Arial" w:hAnsi="Arial" w:cs="Arial"/>
                 <w:sz w:val="18"/>
                 <w:szCs w:val="18"/>
-              </w:rPr>
-            </w:pPr>
-            <w:r>
-              <w:rPr>
-                <w:rFonts w:ascii="Arial" w:hAnsi="Arial" w:cs="Arial"/>
-                <w:sz w:val="18"/>
-                <w:szCs w:val="18"/>
+                <w:lang w:val="pt-BR"/>
+              </w:rPr>
+            </w:pPr>
+            <w:r>
+              <w:rPr>
+                <w:rFonts w:ascii="Arial" w:hAnsi="Arial" w:cs="Arial"/>
+                <w:sz w:val="18"/>
+                <w:szCs w:val="18"/>
+                <w:lang w:val="pt-BR"/>
               </w:rPr>
               <w:t>Status da ordem (Andamento, Cancelada, Finalizada)</w:t>
             </w:r>
@@ -21609,13 +21674,15 @@
                 <w:rFonts w:ascii="Arial" w:hAnsi="Arial" w:cs="Arial"/>
                 <w:sz w:val="18"/>
                 <w:szCs w:val="18"/>
-              </w:rPr>
-            </w:pPr>
-            <w:r>
-              <w:rPr>
-                <w:rFonts w:ascii="Arial" w:hAnsi="Arial" w:cs="Arial"/>
-                <w:sz w:val="18"/>
-                <w:szCs w:val="18"/>
+                <w:lang w:val="pt-BR"/>
+              </w:rPr>
+            </w:pPr>
+            <w:r>
+              <w:rPr>
+                <w:rFonts w:ascii="Arial" w:hAnsi="Arial" w:cs="Arial"/>
+                <w:sz w:val="18"/>
+                <w:szCs w:val="18"/>
+                <w:lang w:val="pt-BR"/>
               </w:rPr>
               <w:t xml:space="preserve">Chave estrangeira referenciando o código da tabela de </w:t>
             </w:r>
@@ -21773,13 +21840,15 @@
                 <w:rFonts w:ascii="Arial" w:hAnsi="Arial" w:cs="Arial"/>
                 <w:sz w:val="18"/>
                 <w:szCs w:val="18"/>
-              </w:rPr>
-            </w:pPr>
-            <w:r>
-              <w:rPr>
-                <w:rFonts w:ascii="Arial" w:hAnsi="Arial" w:cs="Arial"/>
-                <w:sz w:val="18"/>
-                <w:szCs w:val="18"/>
+                <w:lang w:val="pt-BR"/>
+              </w:rPr>
+            </w:pPr>
+            <w:r>
+              <w:rPr>
+                <w:rFonts w:ascii="Arial" w:hAnsi="Arial" w:cs="Arial"/>
+                <w:sz w:val="18"/>
+                <w:szCs w:val="18"/>
+                <w:lang w:val="pt-BR"/>
               </w:rPr>
               <w:t xml:space="preserve">Chave estrangeira referenciando o código da tabela de </w:t>
             </w:r>
@@ -22071,13 +22140,15 @@
                 <w:rFonts w:ascii="Arial" w:hAnsi="Arial" w:cs="Arial"/>
                 <w:sz w:val="18"/>
                 <w:szCs w:val="18"/>
-              </w:rPr>
-            </w:pPr>
-            <w:r>
-              <w:rPr>
-                <w:rFonts w:ascii="Arial" w:hAnsi="Arial" w:cs="Arial"/>
-                <w:sz w:val="18"/>
-                <w:szCs w:val="18"/>
+                <w:lang w:val="pt-BR"/>
+              </w:rPr>
+            </w:pPr>
+            <w:r>
+              <w:rPr>
+                <w:rFonts w:ascii="Arial" w:hAnsi="Arial" w:cs="Arial"/>
+                <w:sz w:val="18"/>
+                <w:szCs w:val="18"/>
+                <w:lang w:val="pt-BR"/>
               </w:rPr>
               <w:t>Armazenará informações da tabela peças e ordem de serviço</w:t>
             </w:r>
@@ -22157,13 +22228,15 @@
                 <w:rFonts w:ascii="Arial" w:hAnsi="Arial" w:cs="Arial"/>
                 <w:sz w:val="18"/>
                 <w:szCs w:val="18"/>
-              </w:rPr>
-            </w:pPr>
-            <w:r>
-              <w:rPr>
-                <w:rFonts w:ascii="Arial" w:hAnsi="Arial" w:cs="Arial"/>
-                <w:sz w:val="18"/>
-                <w:szCs w:val="18"/>
+                <w:lang w:val="pt-BR"/>
+              </w:rPr>
+            </w:pPr>
+            <w:r>
+              <w:rPr>
+                <w:rFonts w:ascii="Arial" w:hAnsi="Arial" w:cs="Arial"/>
+                <w:sz w:val="18"/>
+                <w:szCs w:val="18"/>
+                <w:lang w:val="pt-BR"/>
               </w:rPr>
               <w:t>Possui FK da Peças e Ordem de Serviço</w:t>
             </w:r>
@@ -22192,6 +22265,7 @@
                 <w:rFonts w:ascii="Arial" w:hAnsi="Arial" w:cs="Arial"/>
                 <w:sz w:val="18"/>
                 <w:szCs w:val="18"/>
+                <w:lang w:val="pt-BR"/>
               </w:rPr>
             </w:pPr>
           </w:p>
@@ -22378,6 +22452,7 @@
                 <w:rFonts w:ascii="Arial" w:hAnsi="Arial" w:cs="Arial"/>
                 <w:sz w:val="18"/>
                 <w:szCs w:val="18"/>
+                <w:lang w:val="pt-BR"/>
               </w:rPr>
             </w:pPr>
             <w:r>
@@ -22386,6 +22461,7 @@
                 <w:b/>
                 <w:sz w:val="18"/>
                 <w:szCs w:val="18"/>
+                <w:lang w:val="pt-BR"/>
               </w:rPr>
               <w:t>Restrições de Domínio(PK, FK, NOT NULL, AUTO_INCREMENT)</w:t>
             </w:r>
@@ -22591,13 +22667,15 @@
                 <w:rFonts w:ascii="Arial" w:hAnsi="Arial" w:cs="Arial"/>
                 <w:sz w:val="18"/>
                 <w:szCs w:val="18"/>
-              </w:rPr>
-            </w:pPr>
-            <w:r>
-              <w:rPr>
-                <w:rFonts w:ascii="Arial" w:hAnsi="Arial" w:cs="Arial"/>
-                <w:sz w:val="18"/>
-                <w:szCs w:val="18"/>
+                <w:lang w:val="pt-BR"/>
+              </w:rPr>
+            </w:pPr>
+            <w:r>
+              <w:rPr>
+                <w:rFonts w:ascii="Arial" w:hAnsi="Arial" w:cs="Arial"/>
+                <w:sz w:val="18"/>
+                <w:szCs w:val="18"/>
+                <w:lang w:val="pt-BR"/>
               </w:rPr>
               <w:t>Valor Unitário para os produtos</w:t>
             </w:r>
@@ -22882,13 +22960,15 @@
                 <w:rFonts w:ascii="Arial" w:hAnsi="Arial" w:cs="Arial"/>
                 <w:sz w:val="18"/>
                 <w:szCs w:val="18"/>
-              </w:rPr>
-            </w:pPr>
-            <w:r>
-              <w:rPr>
-                <w:rFonts w:ascii="Arial" w:hAnsi="Arial" w:cs="Arial"/>
-                <w:sz w:val="18"/>
-                <w:szCs w:val="18"/>
+                <w:lang w:val="pt-BR"/>
+              </w:rPr>
+            </w:pPr>
+            <w:r>
+              <w:rPr>
+                <w:rFonts w:ascii="Arial" w:hAnsi="Arial" w:cs="Arial"/>
+                <w:sz w:val="18"/>
+                <w:szCs w:val="18"/>
+                <w:lang w:val="pt-BR"/>
               </w:rPr>
               <w:t>Chave estrangeira referenciando o código da tabela de Ordem de Serviço</w:t>
             </w:r>
@@ -23030,13 +23110,15 @@
                 <w:rFonts w:ascii="Arial" w:hAnsi="Arial" w:cs="Arial"/>
                 <w:sz w:val="18"/>
                 <w:szCs w:val="18"/>
-              </w:rPr>
-            </w:pPr>
-            <w:r>
-              <w:rPr>
-                <w:rFonts w:ascii="Arial" w:hAnsi="Arial" w:cs="Arial"/>
-                <w:sz w:val="18"/>
-                <w:szCs w:val="18"/>
+                <w:lang w:val="pt-BR"/>
+              </w:rPr>
+            </w:pPr>
+            <w:r>
+              <w:rPr>
+                <w:rFonts w:ascii="Arial" w:hAnsi="Arial" w:cs="Arial"/>
+                <w:sz w:val="18"/>
+                <w:szCs w:val="18"/>
+                <w:lang w:val="pt-BR"/>
               </w:rPr>
               <w:t>Chave estrangeira referenciando o código da tabela de Peças</w:t>
             </w:r>
@@ -23311,13 +23393,15 @@
                 <w:rFonts w:ascii="Arial" w:hAnsi="Arial" w:cs="Arial"/>
                 <w:sz w:val="18"/>
                 <w:szCs w:val="18"/>
-              </w:rPr>
-            </w:pPr>
-            <w:r>
-              <w:rPr>
-                <w:rFonts w:ascii="Arial" w:hAnsi="Arial" w:cs="Arial"/>
-                <w:sz w:val="18"/>
-                <w:szCs w:val="18"/>
+                <w:lang w:val="pt-BR"/>
+              </w:rPr>
+            </w:pPr>
+            <w:r>
+              <w:rPr>
+                <w:rFonts w:ascii="Arial" w:hAnsi="Arial" w:cs="Arial"/>
+                <w:sz w:val="18"/>
+                <w:szCs w:val="18"/>
+                <w:lang w:val="pt-BR"/>
               </w:rPr>
               <w:t>Armazenará informação da Peças/Serviço</w:t>
             </w:r>
@@ -23607,6 +23691,7 @@
                 <w:rFonts w:ascii="Arial" w:hAnsi="Arial" w:cs="Arial"/>
                 <w:sz w:val="18"/>
                 <w:szCs w:val="18"/>
+                <w:lang w:val="pt-BR"/>
               </w:rPr>
             </w:pPr>
             <w:r>
@@ -23615,6 +23700,7 @@
                 <w:b/>
                 <w:sz w:val="18"/>
                 <w:szCs w:val="18"/>
+                <w:lang w:val="pt-BR"/>
               </w:rPr>
               <w:t>Restrições de Domínio(PK, FK, NOT NULL, AUTO_INCREMENT)</w:t>
             </w:r>
@@ -23817,13 +23903,15 @@
                 <w:rFonts w:ascii="Arial" w:hAnsi="Arial" w:cs="Arial"/>
                 <w:sz w:val="18"/>
                 <w:szCs w:val="18"/>
-              </w:rPr>
-            </w:pPr>
-            <w:r>
-              <w:rPr>
-                <w:rFonts w:ascii="Arial" w:hAnsi="Arial" w:cs="Arial"/>
-                <w:sz w:val="18"/>
-                <w:szCs w:val="18"/>
+                <w:lang w:val="pt-BR"/>
+              </w:rPr>
+            </w:pPr>
+            <w:r>
+              <w:rPr>
+                <w:rFonts w:ascii="Arial" w:hAnsi="Arial" w:cs="Arial"/>
+                <w:sz w:val="18"/>
+                <w:szCs w:val="18"/>
+                <w:lang w:val="pt-BR"/>
               </w:rPr>
               <w:t>Categoria (verificar se seria um produto ou um serviço)</w:t>
             </w:r>
@@ -24412,13 +24500,15 @@
                 <w:rFonts w:ascii="Arial" w:hAnsi="Arial" w:cs="Arial"/>
                 <w:sz w:val="18"/>
                 <w:szCs w:val="18"/>
-              </w:rPr>
-            </w:pPr>
-            <w:r>
-              <w:rPr>
-                <w:rFonts w:ascii="Arial" w:hAnsi="Arial" w:cs="Arial"/>
-                <w:sz w:val="18"/>
-                <w:szCs w:val="18"/>
+                <w:lang w:val="pt-BR"/>
+              </w:rPr>
+            </w:pPr>
+            <w:r>
+              <w:rPr>
+                <w:rFonts w:ascii="Arial" w:hAnsi="Arial" w:cs="Arial"/>
+                <w:sz w:val="18"/>
+                <w:szCs w:val="18"/>
+                <w:lang w:val="pt-BR"/>
               </w:rPr>
               <w:t>Valor Unitário para os produtos</w:t>
             </w:r>
@@ -24547,13 +24637,15 @@
                 <w:rFonts w:ascii="Arial" w:hAnsi="Arial" w:cs="Arial"/>
                 <w:sz w:val="18"/>
                 <w:szCs w:val="18"/>
-              </w:rPr>
-            </w:pPr>
-            <w:r>
-              <w:rPr>
-                <w:rFonts w:ascii="Arial" w:hAnsi="Arial" w:cs="Arial"/>
-                <w:sz w:val="18"/>
-                <w:szCs w:val="18"/>
+                <w:lang w:val="pt-BR"/>
+              </w:rPr>
+            </w:pPr>
+            <w:r>
+              <w:rPr>
+                <w:rFonts w:ascii="Arial" w:hAnsi="Arial" w:cs="Arial"/>
+                <w:sz w:val="18"/>
+                <w:szCs w:val="18"/>
+                <w:lang w:val="pt-BR"/>
               </w:rPr>
               <w:t>Valor Unitário para os produtos</w:t>
             </w:r>
@@ -24691,13 +24783,15 @@
                 <w:rFonts w:ascii="Arial" w:hAnsi="Arial" w:cs="Arial"/>
                 <w:sz w:val="18"/>
                 <w:szCs w:val="18"/>
-              </w:rPr>
-            </w:pPr>
-            <w:r>
-              <w:rPr>
-                <w:rFonts w:ascii="Arial" w:hAnsi="Arial" w:cs="Arial"/>
-                <w:sz w:val="18"/>
-                <w:szCs w:val="18"/>
+                <w:lang w:val="pt-BR"/>
+              </w:rPr>
+            </w:pPr>
+            <w:r>
+              <w:rPr>
+                <w:rFonts w:ascii="Arial" w:hAnsi="Arial" w:cs="Arial"/>
+                <w:sz w:val="18"/>
+                <w:szCs w:val="18"/>
+                <w:lang w:val="pt-BR"/>
               </w:rPr>
               <w:t>Margem de lucro dos preços</w:t>
             </w:r>
@@ -26078,6 +26172,9 @@
     </w:p>
     <w:p>
       <w:pPr>
+        <w:tabs>
+          <w:tab w:val="left" w:pos="1715"/>
+        </w:tabs>
         <w:rPr>
           <w:b/>
           <w14:textOutline w14:w="12700" w14:cap="flat" w14:cmpd="sng" w14:algn="ctr">
@@ -26114,6 +26211,9 @@
     </w:p>
     <w:p>
       <w:pPr>
+        <w:tabs>
+          <w:tab w:val="left" w:pos="1715"/>
+        </w:tabs>
         <w:rPr>
           <w:b/>
           <w14:textOutline w14:w="12700" w14:cap="flat" w14:cmpd="sng" w14:algn="ctr">
@@ -26150,6 +26250,9 @@
     </w:p>
     <w:p>
       <w:pPr>
+        <w:tabs>
+          <w:tab w:val="left" w:pos="1715"/>
+        </w:tabs>
         <w:rPr>
           <w:b/>
           <w14:textOutline w14:w="12700" w14:cap="flat" w14:cmpd="sng" w14:algn="ctr">
@@ -26186,6 +26289,9 @@
     </w:p>
     <w:p>
       <w:pPr>
+        <w:tabs>
+          <w:tab w:val="left" w:pos="1715"/>
+        </w:tabs>
         <w:rPr>
           <w:b/>
           <w14:textOutline w14:w="12700" w14:cap="flat" w14:cmpd="sng" w14:algn="ctr">
@@ -26222,6 +26328,9 @@
     </w:p>
     <w:p>
       <w:pPr>
+        <w:tabs>
+          <w:tab w:val="left" w:pos="1715"/>
+        </w:tabs>
         <w:rPr>
           <w:b/>
           <w14:textOutline w14:w="12700" w14:cap="flat" w14:cmpd="sng" w14:algn="ctr">
@@ -26258,6 +26367,9 @@
     </w:p>
     <w:p>
       <w:pPr>
+        <w:tabs>
+          <w:tab w:val="left" w:pos="1715"/>
+        </w:tabs>
         <w:rPr>
           <w:b/>
           <w14:textOutline w14:w="12700" w14:cap="flat" w14:cmpd="sng" w14:algn="ctr">
@@ -26294,6 +26406,9 @@
     </w:p>
     <w:p>
       <w:pPr>
+        <w:tabs>
+          <w:tab w:val="left" w:pos="1715"/>
+        </w:tabs>
         <w:rPr>
           <w:b/>
           <w14:textOutline w14:w="12700" w14:cap="flat" w14:cmpd="sng" w14:algn="ctr">
@@ -26330,6 +26445,9 @@
     </w:p>
     <w:p>
       <w:pPr>
+        <w:tabs>
+          <w:tab w:val="left" w:pos="1715"/>
+        </w:tabs>
         <w:rPr>
           <w:b/>
           <w14:textOutline w14:w="12700" w14:cap="flat" w14:cmpd="sng" w14:algn="ctr">
@@ -26366,6 +26484,9 @@
     </w:p>
     <w:p>
       <w:pPr>
+        <w:tabs>
+          <w:tab w:val="left" w:pos="1715"/>
+        </w:tabs>
         <w:rPr>
           <w:b/>
           <w14:textOutline w14:w="12700" w14:cap="flat" w14:cmpd="sng" w14:algn="ctr">
@@ -26402,6 +26523,9 @@
     </w:p>
     <w:p>
       <w:pPr>
+        <w:tabs>
+          <w:tab w:val="left" w:pos="1715"/>
+        </w:tabs>
         <w:rPr>
           <w:b/>
           <w14:textOutline w14:w="12700" w14:cap="flat" w14:cmpd="sng" w14:algn="ctr">
@@ -26438,6 +26562,9 @@
     </w:p>
     <w:p>
       <w:pPr>
+        <w:tabs>
+          <w:tab w:val="left" w:pos="1715"/>
+        </w:tabs>
         <w:rPr>
           <w:b/>
           <w14:textOutline w14:w="12700" w14:cap="flat" w14:cmpd="sng" w14:algn="ctr">
@@ -26474,6 +26601,9 @@
     </w:p>
     <w:p>
       <w:pPr>
+        <w:tabs>
+          <w:tab w:val="left" w:pos="1715"/>
+        </w:tabs>
         <w:rPr>
           <w:b/>
           <w14:textOutline w14:w="12700" w14:cap="flat" w14:cmpd="sng" w14:algn="ctr">
@@ -26510,6 +26640,9 @@
     </w:p>
     <w:p>
       <w:pPr>
+        <w:tabs>
+          <w:tab w:val="left" w:pos="1715"/>
+        </w:tabs>
         <w:rPr>
           <w:b/>
           <w14:textOutline w14:w="12700" w14:cap="flat" w14:cmpd="sng" w14:algn="ctr">
@@ -26546,6 +26679,9 @@
     </w:p>
     <w:p>
       <w:pPr>
+        <w:tabs>
+          <w:tab w:val="left" w:pos="1715"/>
+        </w:tabs>
         <w:rPr>
           <w:b/>
           <w14:textOutline w14:w="12700" w14:cap="flat" w14:cmpd="sng" w14:algn="ctr">
@@ -26582,6 +26718,9 @@
     </w:p>
     <w:p>
       <w:pPr>
+        <w:tabs>
+          <w:tab w:val="left" w:pos="1715"/>
+        </w:tabs>
         <w:rPr>
           <w:b/>
           <w14:textOutline w14:w="12700" w14:cap="flat" w14:cmpd="sng" w14:algn="ctr">
@@ -26618,6 +26757,9 @@
     </w:p>
     <w:p>
       <w:pPr>
+        <w:tabs>
+          <w:tab w:val="left" w:pos="1715"/>
+        </w:tabs>
         <w:rPr>
           <w:b/>
           <w14:textOutline w14:w="12700" w14:cap="flat" w14:cmpd="sng" w14:algn="ctr">
@@ -26651,9 +26793,7 @@
           </w14:textFill>
         </w:rPr>
       </w:pPr>
-    </w:p>
-    <w:p>
-      <w:pPr>
+      <w:r>
         <w:rPr>
           <w:b/>
           <w14:textOutline w14:w="12700" w14:cap="flat" w14:cmpd="sng" w14:algn="ctr">
@@ -26686,8 +26826,15 @@
             </w14:gradFill>
           </w14:textFill>
         </w:rPr>
-      </w:pPr>
-      <w:r>
+        <w:lastRenderedPageBreak/>
+        <w:t>Home</w:t>
+      </w:r>
+    </w:p>
+    <w:p>
+      <w:pPr>
+        <w:tabs>
+          <w:tab w:val="left" w:pos="1715"/>
+        </w:tabs>
         <w:rPr>
           <w:b/>
           <w14:textOutline w14:w="12700" w14:cap="flat" w14:cmpd="sng" w14:algn="ctr">
@@ -26720,10 +26867,1178 @@
             </w14:gradFill>
           </w14:textFill>
         </w:rPr>
+      </w:pPr>
+    </w:p>
+    <w:p>
+      <w:pPr>
+        <w:tabs>
+          <w:tab w:val="left" w:pos="1715"/>
+        </w:tabs>
+        <w:rPr>
+          <w:b/>
+          <w14:textOutline w14:w="12700" w14:cap="flat" w14:cmpd="sng" w14:algn="ctr">
+            <w14:solidFill>
+              <w14:schemeClr w14:val="accent4"/>
+            </w14:solidFill>
+            <w14:prstDash w14:val="solid"/>
+            <w14:round/>
+          </w14:textOutline>
+          <w14:textFill>
+            <w14:gradFill>
+              <w14:gsLst>
+                <w14:gs w14:pos="0">
+                  <w14:schemeClr w14:val="accent4"/>
+                </w14:gs>
+                <w14:gs w14:pos="4000">
+                  <w14:schemeClr w14:val="accent4">
+                    <w14:lumMod w14:val="60000"/>
+                    <w14:lumOff w14:val="40000"/>
+                  </w14:schemeClr>
+                </w14:gs>
+                <w14:gs w14:pos="87000">
+                  <w14:schemeClr w14:val="accent4">
+                    <w14:lumMod w14:val="20000"/>
+                    <w14:lumOff w14:val="80000"/>
+                  </w14:schemeClr>
+                </w14:gs>
+              </w14:gsLst>
+              <w14:lin w14:ang="5400000" w14:scaled="0"/>
+            </w14:gradFill>
+          </w14:textFill>
+        </w:rPr>
+      </w:pPr>
+      <w:r>
+        <w:rPr>
+          <w:b/>
+          <w:noProof/>
+          <w14:textOutline w14:w="12700" w14:cap="flat" w14:cmpd="sng" w14:algn="ctr">
+            <w14:solidFill>
+              <w14:schemeClr w14:val="accent4"/>
+            </w14:solidFill>
+            <w14:prstDash w14:val="solid"/>
+            <w14:round/>
+          </w14:textOutline>
+          <w14:textFill>
+            <w14:gradFill>
+              <w14:gsLst>
+                <w14:gs w14:pos="0">
+                  <w14:schemeClr w14:val="accent4"/>
+                </w14:gs>
+                <w14:gs w14:pos="4000">
+                  <w14:schemeClr w14:val="accent4">
+                    <w14:lumMod w14:val="60000"/>
+                    <w14:lumOff w14:val="40000"/>
+                  </w14:schemeClr>
+                </w14:gs>
+                <w14:gs w14:pos="87000">
+                  <w14:schemeClr w14:val="accent4">
+                    <w14:lumMod w14:val="20000"/>
+                    <w14:lumOff w14:val="80000"/>
+                  </w14:schemeClr>
+                </w14:gs>
+              </w14:gsLst>
+              <w14:lin w14:ang="5400000" w14:scaled="0"/>
+            </w14:gradFill>
+          </w14:textFill>
+        </w:rPr>
+        <w:drawing>
+          <wp:inline distT="0" distB="0" distL="0" distR="0" wp14:anchorId="4DA1E49A" wp14:editId="1BF73789">
+            <wp:extent cx="5733415" cy="4075430"/>
+            <wp:effectExtent l="0" t="0" r="635" b="1270"/>
+            <wp:docPr id="10" name="Imagem 10"/>
+            <wp:cNvGraphicFramePr>
+              <a:graphicFrameLocks xmlns:a="http://schemas.openxmlformats.org/drawingml/2006/main" noChangeAspect="1"/>
+            </wp:cNvGraphicFramePr>
+            <a:graphic xmlns:a="http://schemas.openxmlformats.org/drawingml/2006/main">
+              <a:graphicData uri="http://schemas.openxmlformats.org/drawingml/2006/picture">
+                <pic:pic xmlns:pic="http://schemas.openxmlformats.org/drawingml/2006/picture">
+                  <pic:nvPicPr>
+                    <pic:cNvPr id="1" name=""/>
+                    <pic:cNvPicPr/>
+                  </pic:nvPicPr>
+                  <pic:blipFill>
+                    <a:blip r:embed="rId22"/>
+                    <a:stretch>
+                      <a:fillRect/>
+                    </a:stretch>
+                  </pic:blipFill>
+                  <pic:spPr>
+                    <a:xfrm>
+                      <a:off x="0" y="0"/>
+                      <a:ext cx="5733415" cy="4075430"/>
+                    </a:xfrm>
+                    <a:prstGeom prst="rect">
+                      <a:avLst/>
+                    </a:prstGeom>
+                  </pic:spPr>
+                </pic:pic>
+              </a:graphicData>
+            </a:graphic>
+          </wp:inline>
+        </w:drawing>
+      </w:r>
+    </w:p>
+    <w:p>
+      <w:pPr>
+        <w:tabs>
+          <w:tab w:val="left" w:pos="1715"/>
+        </w:tabs>
+        <w:rPr>
+          <w:b/>
+          <w14:textOutline w14:w="12700" w14:cap="flat" w14:cmpd="sng" w14:algn="ctr">
+            <w14:solidFill>
+              <w14:schemeClr w14:val="accent4"/>
+            </w14:solidFill>
+            <w14:prstDash w14:val="solid"/>
+            <w14:round/>
+          </w14:textOutline>
+          <w14:textFill>
+            <w14:gradFill>
+              <w14:gsLst>
+                <w14:gs w14:pos="0">
+                  <w14:schemeClr w14:val="accent4"/>
+                </w14:gs>
+                <w14:gs w14:pos="4000">
+                  <w14:schemeClr w14:val="accent4">
+                    <w14:lumMod w14:val="60000"/>
+                    <w14:lumOff w14:val="40000"/>
+                  </w14:schemeClr>
+                </w14:gs>
+                <w14:gs w14:pos="87000">
+                  <w14:schemeClr w14:val="accent4">
+                    <w14:lumMod w14:val="20000"/>
+                    <w14:lumOff w14:val="80000"/>
+                  </w14:schemeClr>
+                </w14:gs>
+              </w14:gsLst>
+              <w14:lin w14:ang="5400000" w14:scaled="0"/>
+            </w14:gradFill>
+          </w14:textFill>
+        </w:rPr>
+      </w:pPr>
+    </w:p>
+    <w:p>
+      <w:pPr>
+        <w:tabs>
+          <w:tab w:val="left" w:pos="1715"/>
+        </w:tabs>
+        <w:rPr>
+          <w:b/>
+          <w14:textOutline w14:w="12700" w14:cap="flat" w14:cmpd="sng" w14:algn="ctr">
+            <w14:solidFill>
+              <w14:schemeClr w14:val="accent4"/>
+            </w14:solidFill>
+            <w14:prstDash w14:val="solid"/>
+            <w14:round/>
+          </w14:textOutline>
+          <w14:textFill>
+            <w14:gradFill>
+              <w14:gsLst>
+                <w14:gs w14:pos="0">
+                  <w14:schemeClr w14:val="accent4"/>
+                </w14:gs>
+                <w14:gs w14:pos="4000">
+                  <w14:schemeClr w14:val="accent4">
+                    <w14:lumMod w14:val="60000"/>
+                    <w14:lumOff w14:val="40000"/>
+                  </w14:schemeClr>
+                </w14:gs>
+                <w14:gs w14:pos="87000">
+                  <w14:schemeClr w14:val="accent4">
+                    <w14:lumMod w14:val="20000"/>
+                    <w14:lumOff w14:val="80000"/>
+                  </w14:schemeClr>
+                </w14:gs>
+              </w14:gsLst>
+              <w14:lin w14:ang="5400000" w14:scaled="0"/>
+            </w14:gradFill>
+          </w14:textFill>
+        </w:rPr>
+      </w:pPr>
+      <w:r>
+        <w:rPr>
+          <w:b/>
+          <w:noProof/>
+          <w14:textOutline w14:w="12700" w14:cap="flat" w14:cmpd="sng" w14:algn="ctr">
+            <w14:solidFill>
+              <w14:schemeClr w14:val="accent4"/>
+            </w14:solidFill>
+            <w14:prstDash w14:val="solid"/>
+            <w14:round/>
+          </w14:textOutline>
+          <w14:textFill>
+            <w14:gradFill>
+              <w14:gsLst>
+                <w14:gs w14:pos="0">
+                  <w14:schemeClr w14:val="accent4"/>
+                </w14:gs>
+                <w14:gs w14:pos="4000">
+                  <w14:schemeClr w14:val="accent4">
+                    <w14:lumMod w14:val="60000"/>
+                    <w14:lumOff w14:val="40000"/>
+                  </w14:schemeClr>
+                </w14:gs>
+                <w14:gs w14:pos="87000">
+                  <w14:schemeClr w14:val="accent4">
+                    <w14:lumMod w14:val="20000"/>
+                    <w14:lumOff w14:val="80000"/>
+                  </w14:schemeClr>
+                </w14:gs>
+              </w14:gsLst>
+              <w14:lin w14:ang="5400000" w14:scaled="0"/>
+            </w14:gradFill>
+          </w14:textFill>
+        </w:rPr>
+        <w:lastRenderedPageBreak/>
+        <w:drawing>
+          <wp:anchor distT="0" distB="0" distL="114300" distR="114300" simplePos="0" relativeHeight="251672576" behindDoc="0" locked="0" layoutInCell="1" allowOverlap="1" wp14:anchorId="6CC298E2" wp14:editId="3C57573E">
+            <wp:simplePos x="0" y="0"/>
+            <wp:positionH relativeFrom="margin">
+              <wp:align>right</wp:align>
+            </wp:positionH>
+            <wp:positionV relativeFrom="paragraph">
+              <wp:posOffset>317500</wp:posOffset>
+            </wp:positionV>
+            <wp:extent cx="5733415" cy="4077335"/>
+            <wp:effectExtent l="0" t="0" r="635" b="0"/>
+            <wp:wrapSquare wrapText="bothSides"/>
+            <wp:docPr id="11" name="Imagem 11"/>
+            <wp:cNvGraphicFramePr>
+              <a:graphicFrameLocks xmlns:a="http://schemas.openxmlformats.org/drawingml/2006/main" noChangeAspect="1"/>
+            </wp:cNvGraphicFramePr>
+            <a:graphic xmlns:a="http://schemas.openxmlformats.org/drawingml/2006/main">
+              <a:graphicData uri="http://schemas.openxmlformats.org/drawingml/2006/picture">
+                <pic:pic xmlns:pic="http://schemas.openxmlformats.org/drawingml/2006/picture">
+                  <pic:nvPicPr>
+                    <pic:cNvPr id="1" name=""/>
+                    <pic:cNvPicPr/>
+                  </pic:nvPicPr>
+                  <pic:blipFill>
+                    <a:blip r:embed="rId23">
+                      <a:extLst>
+                        <a:ext uri="{28A0092B-C50C-407E-A947-70E740481C1C}">
+                          <a14:useLocalDpi xmlns:a14="http://schemas.microsoft.com/office/drawing/2010/main" val="0"/>
+                        </a:ext>
+                      </a:extLst>
+                    </a:blip>
+                    <a:stretch>
+                      <a:fillRect/>
+                    </a:stretch>
+                  </pic:blipFill>
+                  <pic:spPr>
+                    <a:xfrm>
+                      <a:off x="0" y="0"/>
+                      <a:ext cx="5733415" cy="4077335"/>
+                    </a:xfrm>
+                    <a:prstGeom prst="rect">
+                      <a:avLst/>
+                    </a:prstGeom>
+                  </pic:spPr>
+                </pic:pic>
+              </a:graphicData>
+            </a:graphic>
+          </wp:anchor>
+        </w:drawing>
+      </w:r>
+      <w:r>
+        <w:rPr>
+          <w:b/>
+          <w14:textOutline w14:w="12700" w14:cap="flat" w14:cmpd="sng" w14:algn="ctr">
+            <w14:solidFill>
+              <w14:schemeClr w14:val="accent4"/>
+            </w14:solidFill>
+            <w14:prstDash w14:val="solid"/>
+            <w14:round/>
+          </w14:textOutline>
+          <w14:textFill>
+            <w14:gradFill>
+              <w14:gsLst>
+                <w14:gs w14:pos="0">
+                  <w14:schemeClr w14:val="accent4"/>
+                </w14:gs>
+                <w14:gs w14:pos="4000">
+                  <w14:schemeClr w14:val="accent4">
+                    <w14:lumMod w14:val="60000"/>
+                    <w14:lumOff w14:val="40000"/>
+                  </w14:schemeClr>
+                </w14:gs>
+                <w14:gs w14:pos="87000">
+                  <w14:schemeClr w14:val="accent4">
+                    <w14:lumMod w14:val="20000"/>
+                    <w14:lumOff w14:val="80000"/>
+                  </w14:schemeClr>
+                </w14:gs>
+              </w14:gsLst>
+              <w14:lin w14:ang="5400000" w14:scaled="0"/>
+            </w14:gradFill>
+          </w14:textFill>
+        </w:rPr>
+        <w:t xml:space="preserve">Home2 </w:t>
+      </w:r>
+      <w:r>
+        <w:rPr>
+          <w:b/>
+          <w14:textOutline w14:w="12700" w14:cap="flat" w14:cmpd="sng" w14:algn="ctr">
+            <w14:solidFill>
+              <w14:schemeClr w14:val="accent4"/>
+            </w14:solidFill>
+            <w14:prstDash w14:val="solid"/>
+            <w14:round/>
+          </w14:textOutline>
+          <w14:textFill>
+            <w14:gradFill>
+              <w14:gsLst>
+                <w14:gs w14:pos="0">
+                  <w14:schemeClr w14:val="accent4"/>
+                </w14:gs>
+                <w14:gs w14:pos="4000">
+                  <w14:schemeClr w14:val="accent4">
+                    <w14:lumMod w14:val="60000"/>
+                    <w14:lumOff w14:val="40000"/>
+                  </w14:schemeClr>
+                </w14:gs>
+                <w14:gs w14:pos="87000">
+                  <w14:schemeClr w14:val="accent4">
+                    <w14:lumMod w14:val="20000"/>
+                    <w14:lumOff w14:val="80000"/>
+                  </w14:schemeClr>
+                </w14:gs>
+              </w14:gsLst>
+              <w14:lin w14:ang="5400000" w14:scaled="0"/>
+            </w14:gradFill>
+          </w14:textFill>
+        </w:rPr>
+        <w:br/>
+        <w:t xml:space="preserve"> </w:t>
+      </w:r>
+    </w:p>
+    <w:p>
+      <w:pPr>
+        <w:rPr>
+          <w:b/>
+          <w14:textOutline w14:w="12700" w14:cap="flat" w14:cmpd="sng" w14:algn="ctr">
+            <w14:solidFill>
+              <w14:schemeClr w14:val="accent4"/>
+            </w14:solidFill>
+            <w14:prstDash w14:val="solid"/>
+            <w14:round/>
+          </w14:textOutline>
+          <w14:textFill>
+            <w14:gradFill>
+              <w14:gsLst>
+                <w14:gs w14:pos="0">
+                  <w14:schemeClr w14:val="accent4"/>
+                </w14:gs>
+                <w14:gs w14:pos="4000">
+                  <w14:schemeClr w14:val="accent4">
+                    <w14:lumMod w14:val="60000"/>
+                    <w14:lumOff w14:val="40000"/>
+                  </w14:schemeClr>
+                </w14:gs>
+                <w14:gs w14:pos="87000">
+                  <w14:schemeClr w14:val="accent4">
+                    <w14:lumMod w14:val="20000"/>
+                    <w14:lumOff w14:val="80000"/>
+                  </w14:schemeClr>
+                </w14:gs>
+              </w14:gsLst>
+              <w14:lin w14:ang="5400000" w14:scaled="0"/>
+            </w14:gradFill>
+          </w14:textFill>
+        </w:rPr>
+      </w:pPr>
+    </w:p>
+    <w:p>
+      <w:pPr>
+        <w:rPr>
+          <w:b/>
+          <w14:textOutline w14:w="12700" w14:cap="flat" w14:cmpd="sng" w14:algn="ctr">
+            <w14:solidFill>
+              <w14:schemeClr w14:val="accent4"/>
+            </w14:solidFill>
+            <w14:prstDash w14:val="solid"/>
+            <w14:round/>
+          </w14:textOutline>
+          <w14:textFill>
+            <w14:gradFill>
+              <w14:gsLst>
+                <w14:gs w14:pos="0">
+                  <w14:schemeClr w14:val="accent4"/>
+                </w14:gs>
+                <w14:gs w14:pos="4000">
+                  <w14:schemeClr w14:val="accent4">
+                    <w14:lumMod w14:val="60000"/>
+                    <w14:lumOff w14:val="40000"/>
+                  </w14:schemeClr>
+                </w14:gs>
+                <w14:gs w14:pos="87000">
+                  <w14:schemeClr w14:val="accent4">
+                    <w14:lumMod w14:val="20000"/>
+                    <w14:lumOff w14:val="80000"/>
+                  </w14:schemeClr>
+                </w14:gs>
+              </w14:gsLst>
+              <w14:lin w14:ang="5400000" w14:scaled="0"/>
+            </w14:gradFill>
+          </w14:textFill>
+        </w:rPr>
+      </w:pPr>
+    </w:p>
+    <w:p>
+      <w:pPr>
+        <w:rPr>
+          <w:b/>
+          <w14:textOutline w14:w="12700" w14:cap="flat" w14:cmpd="sng" w14:algn="ctr">
+            <w14:solidFill>
+              <w14:schemeClr w14:val="accent4"/>
+            </w14:solidFill>
+            <w14:prstDash w14:val="solid"/>
+            <w14:round/>
+          </w14:textOutline>
+          <w14:textFill>
+            <w14:gradFill>
+              <w14:gsLst>
+                <w14:gs w14:pos="0">
+                  <w14:schemeClr w14:val="accent4"/>
+                </w14:gs>
+                <w14:gs w14:pos="4000">
+                  <w14:schemeClr w14:val="accent4">
+                    <w14:lumMod w14:val="60000"/>
+                    <w14:lumOff w14:val="40000"/>
+                  </w14:schemeClr>
+                </w14:gs>
+                <w14:gs w14:pos="87000">
+                  <w14:schemeClr w14:val="accent4">
+                    <w14:lumMod w14:val="20000"/>
+                    <w14:lumOff w14:val="80000"/>
+                  </w14:schemeClr>
+                </w14:gs>
+              </w14:gsLst>
+              <w14:lin w14:ang="5400000" w14:scaled="0"/>
+            </w14:gradFill>
+          </w14:textFill>
+        </w:rPr>
+      </w:pPr>
+    </w:p>
+    <w:p>
+      <w:pPr>
+        <w:rPr>
+          <w:b/>
+          <w14:textOutline w14:w="12700" w14:cap="flat" w14:cmpd="sng" w14:algn="ctr">
+            <w14:solidFill>
+              <w14:schemeClr w14:val="accent4"/>
+            </w14:solidFill>
+            <w14:prstDash w14:val="solid"/>
+            <w14:round/>
+          </w14:textOutline>
+          <w14:textFill>
+            <w14:gradFill>
+              <w14:gsLst>
+                <w14:gs w14:pos="0">
+                  <w14:schemeClr w14:val="accent4"/>
+                </w14:gs>
+                <w14:gs w14:pos="4000">
+                  <w14:schemeClr w14:val="accent4">
+                    <w14:lumMod w14:val="60000"/>
+                    <w14:lumOff w14:val="40000"/>
+                  </w14:schemeClr>
+                </w14:gs>
+                <w14:gs w14:pos="87000">
+                  <w14:schemeClr w14:val="accent4">
+                    <w14:lumMod w14:val="20000"/>
+                    <w14:lumOff w14:val="80000"/>
+                  </w14:schemeClr>
+                </w14:gs>
+              </w14:gsLst>
+              <w14:lin w14:ang="5400000" w14:scaled="0"/>
+            </w14:gradFill>
+          </w14:textFill>
+        </w:rPr>
+      </w:pPr>
+    </w:p>
+    <w:p>
+      <w:pPr>
+        <w:rPr>
+          <w:b/>
+          <w14:textOutline w14:w="12700" w14:cap="flat" w14:cmpd="sng" w14:algn="ctr">
+            <w14:solidFill>
+              <w14:schemeClr w14:val="accent4"/>
+            </w14:solidFill>
+            <w14:prstDash w14:val="solid"/>
+            <w14:round/>
+          </w14:textOutline>
+          <w14:textFill>
+            <w14:gradFill>
+              <w14:gsLst>
+                <w14:gs w14:pos="0">
+                  <w14:schemeClr w14:val="accent4"/>
+                </w14:gs>
+                <w14:gs w14:pos="4000">
+                  <w14:schemeClr w14:val="accent4">
+                    <w14:lumMod w14:val="60000"/>
+                    <w14:lumOff w14:val="40000"/>
+                  </w14:schemeClr>
+                </w14:gs>
+                <w14:gs w14:pos="87000">
+                  <w14:schemeClr w14:val="accent4">
+                    <w14:lumMod w14:val="20000"/>
+                    <w14:lumOff w14:val="80000"/>
+                  </w14:schemeClr>
+                </w14:gs>
+              </w14:gsLst>
+              <w14:lin w14:ang="5400000" w14:scaled="0"/>
+            </w14:gradFill>
+          </w14:textFill>
+        </w:rPr>
+      </w:pPr>
+    </w:p>
+    <w:p>
+      <w:pPr>
+        <w:rPr>
+          <w:b/>
+          <w14:textOutline w14:w="12700" w14:cap="flat" w14:cmpd="sng" w14:algn="ctr">
+            <w14:solidFill>
+              <w14:schemeClr w14:val="accent4"/>
+            </w14:solidFill>
+            <w14:prstDash w14:val="solid"/>
+            <w14:round/>
+          </w14:textOutline>
+          <w14:textFill>
+            <w14:gradFill>
+              <w14:gsLst>
+                <w14:gs w14:pos="0">
+                  <w14:schemeClr w14:val="accent4"/>
+                </w14:gs>
+                <w14:gs w14:pos="4000">
+                  <w14:schemeClr w14:val="accent4">
+                    <w14:lumMod w14:val="60000"/>
+                    <w14:lumOff w14:val="40000"/>
+                  </w14:schemeClr>
+                </w14:gs>
+                <w14:gs w14:pos="87000">
+                  <w14:schemeClr w14:val="accent4">
+                    <w14:lumMod w14:val="20000"/>
+                    <w14:lumOff w14:val="80000"/>
+                  </w14:schemeClr>
+                </w14:gs>
+              </w14:gsLst>
+              <w14:lin w14:ang="5400000" w14:scaled="0"/>
+            </w14:gradFill>
+          </w14:textFill>
+        </w:rPr>
+      </w:pPr>
+    </w:p>
+    <w:p>
+      <w:pPr>
+        <w:rPr>
+          <w:b/>
+          <w14:textOutline w14:w="12700" w14:cap="flat" w14:cmpd="sng" w14:algn="ctr">
+            <w14:solidFill>
+              <w14:schemeClr w14:val="accent4"/>
+            </w14:solidFill>
+            <w14:prstDash w14:val="solid"/>
+            <w14:round/>
+          </w14:textOutline>
+          <w14:textFill>
+            <w14:gradFill>
+              <w14:gsLst>
+                <w14:gs w14:pos="0">
+                  <w14:schemeClr w14:val="accent4"/>
+                </w14:gs>
+                <w14:gs w14:pos="4000">
+                  <w14:schemeClr w14:val="accent4">
+                    <w14:lumMod w14:val="60000"/>
+                    <w14:lumOff w14:val="40000"/>
+                  </w14:schemeClr>
+                </w14:gs>
+                <w14:gs w14:pos="87000">
+                  <w14:schemeClr w14:val="accent4">
+                    <w14:lumMod w14:val="20000"/>
+                    <w14:lumOff w14:val="80000"/>
+                  </w14:schemeClr>
+                </w14:gs>
+              </w14:gsLst>
+              <w14:lin w14:ang="5400000" w14:scaled="0"/>
+            </w14:gradFill>
+          </w14:textFill>
+        </w:rPr>
+      </w:pPr>
+    </w:p>
+    <w:p>
+      <w:pPr>
+        <w:rPr>
+          <w:b/>
+          <w14:textOutline w14:w="12700" w14:cap="flat" w14:cmpd="sng" w14:algn="ctr">
+            <w14:solidFill>
+              <w14:schemeClr w14:val="accent4"/>
+            </w14:solidFill>
+            <w14:prstDash w14:val="solid"/>
+            <w14:round/>
+          </w14:textOutline>
+          <w14:textFill>
+            <w14:gradFill>
+              <w14:gsLst>
+                <w14:gs w14:pos="0">
+                  <w14:schemeClr w14:val="accent4"/>
+                </w14:gs>
+                <w14:gs w14:pos="4000">
+                  <w14:schemeClr w14:val="accent4">
+                    <w14:lumMod w14:val="60000"/>
+                    <w14:lumOff w14:val="40000"/>
+                  </w14:schemeClr>
+                </w14:gs>
+                <w14:gs w14:pos="87000">
+                  <w14:schemeClr w14:val="accent4">
+                    <w14:lumMod w14:val="20000"/>
+                    <w14:lumOff w14:val="80000"/>
+                  </w14:schemeClr>
+                </w14:gs>
+              </w14:gsLst>
+              <w14:lin w14:ang="5400000" w14:scaled="0"/>
+            </w14:gradFill>
+          </w14:textFill>
+        </w:rPr>
+      </w:pPr>
+    </w:p>
+    <w:p>
+      <w:pPr>
+        <w:rPr>
+          <w:b/>
+          <w14:textOutline w14:w="12700" w14:cap="flat" w14:cmpd="sng" w14:algn="ctr">
+            <w14:solidFill>
+              <w14:schemeClr w14:val="accent4"/>
+            </w14:solidFill>
+            <w14:prstDash w14:val="solid"/>
+            <w14:round/>
+          </w14:textOutline>
+          <w14:textFill>
+            <w14:gradFill>
+              <w14:gsLst>
+                <w14:gs w14:pos="0">
+                  <w14:schemeClr w14:val="accent4"/>
+                </w14:gs>
+                <w14:gs w14:pos="4000">
+                  <w14:schemeClr w14:val="accent4">
+                    <w14:lumMod w14:val="60000"/>
+                    <w14:lumOff w14:val="40000"/>
+                  </w14:schemeClr>
+                </w14:gs>
+                <w14:gs w14:pos="87000">
+                  <w14:schemeClr w14:val="accent4">
+                    <w14:lumMod w14:val="20000"/>
+                    <w14:lumOff w14:val="80000"/>
+                  </w14:schemeClr>
+                </w14:gs>
+              </w14:gsLst>
+              <w14:lin w14:ang="5400000" w14:scaled="0"/>
+            </w14:gradFill>
+          </w14:textFill>
+        </w:rPr>
+      </w:pPr>
+    </w:p>
+    <w:p>
+      <w:pPr>
+        <w:rPr>
+          <w:b/>
+          <w14:textOutline w14:w="12700" w14:cap="flat" w14:cmpd="sng" w14:algn="ctr">
+            <w14:solidFill>
+              <w14:schemeClr w14:val="accent4"/>
+            </w14:solidFill>
+            <w14:prstDash w14:val="solid"/>
+            <w14:round/>
+          </w14:textOutline>
+          <w14:textFill>
+            <w14:gradFill>
+              <w14:gsLst>
+                <w14:gs w14:pos="0">
+                  <w14:schemeClr w14:val="accent4"/>
+                </w14:gs>
+                <w14:gs w14:pos="4000">
+                  <w14:schemeClr w14:val="accent4">
+                    <w14:lumMod w14:val="60000"/>
+                    <w14:lumOff w14:val="40000"/>
+                  </w14:schemeClr>
+                </w14:gs>
+                <w14:gs w14:pos="87000">
+                  <w14:schemeClr w14:val="accent4">
+                    <w14:lumMod w14:val="20000"/>
+                    <w14:lumOff w14:val="80000"/>
+                  </w14:schemeClr>
+                </w14:gs>
+              </w14:gsLst>
+              <w14:lin w14:ang="5400000" w14:scaled="0"/>
+            </w14:gradFill>
+          </w14:textFill>
+        </w:rPr>
+      </w:pPr>
+    </w:p>
+    <w:p>
+      <w:pPr>
+        <w:rPr>
+          <w:b/>
+          <w14:textOutline w14:w="12700" w14:cap="flat" w14:cmpd="sng" w14:algn="ctr">
+            <w14:solidFill>
+              <w14:schemeClr w14:val="accent4"/>
+            </w14:solidFill>
+            <w14:prstDash w14:val="solid"/>
+            <w14:round/>
+          </w14:textOutline>
+          <w14:textFill>
+            <w14:gradFill>
+              <w14:gsLst>
+                <w14:gs w14:pos="0">
+                  <w14:schemeClr w14:val="accent4"/>
+                </w14:gs>
+                <w14:gs w14:pos="4000">
+                  <w14:schemeClr w14:val="accent4">
+                    <w14:lumMod w14:val="60000"/>
+                    <w14:lumOff w14:val="40000"/>
+                  </w14:schemeClr>
+                </w14:gs>
+                <w14:gs w14:pos="87000">
+                  <w14:schemeClr w14:val="accent4">
+                    <w14:lumMod w14:val="20000"/>
+                    <w14:lumOff w14:val="80000"/>
+                  </w14:schemeClr>
+                </w14:gs>
+              </w14:gsLst>
+              <w14:lin w14:ang="5400000" w14:scaled="0"/>
+            </w14:gradFill>
+          </w14:textFill>
+        </w:rPr>
+      </w:pPr>
+    </w:p>
+    <w:p>
+      <w:pPr>
+        <w:rPr>
+          <w:b/>
+          <w14:textOutline w14:w="12700" w14:cap="flat" w14:cmpd="sng" w14:algn="ctr">
+            <w14:solidFill>
+              <w14:schemeClr w14:val="accent4"/>
+            </w14:solidFill>
+            <w14:prstDash w14:val="solid"/>
+            <w14:round/>
+          </w14:textOutline>
+          <w14:textFill>
+            <w14:gradFill>
+              <w14:gsLst>
+                <w14:gs w14:pos="0">
+                  <w14:schemeClr w14:val="accent4"/>
+                </w14:gs>
+                <w14:gs w14:pos="4000">
+                  <w14:schemeClr w14:val="accent4">
+                    <w14:lumMod w14:val="60000"/>
+                    <w14:lumOff w14:val="40000"/>
+                  </w14:schemeClr>
+                </w14:gs>
+                <w14:gs w14:pos="87000">
+                  <w14:schemeClr w14:val="accent4">
+                    <w14:lumMod w14:val="20000"/>
+                    <w14:lumOff w14:val="80000"/>
+                  </w14:schemeClr>
+                </w14:gs>
+              </w14:gsLst>
+              <w14:lin w14:ang="5400000" w14:scaled="0"/>
+            </w14:gradFill>
+          </w14:textFill>
+        </w:rPr>
+      </w:pPr>
+    </w:p>
+    <w:p>
+      <w:pPr>
+        <w:rPr>
+          <w:b/>
+          <w14:textOutline w14:w="12700" w14:cap="flat" w14:cmpd="sng" w14:algn="ctr">
+            <w14:solidFill>
+              <w14:schemeClr w14:val="accent4"/>
+            </w14:solidFill>
+            <w14:prstDash w14:val="solid"/>
+            <w14:round/>
+          </w14:textOutline>
+          <w14:textFill>
+            <w14:gradFill>
+              <w14:gsLst>
+                <w14:gs w14:pos="0">
+                  <w14:schemeClr w14:val="accent4"/>
+                </w14:gs>
+                <w14:gs w14:pos="4000">
+                  <w14:schemeClr w14:val="accent4">
+                    <w14:lumMod w14:val="60000"/>
+                    <w14:lumOff w14:val="40000"/>
+                  </w14:schemeClr>
+                </w14:gs>
+                <w14:gs w14:pos="87000">
+                  <w14:schemeClr w14:val="accent4">
+                    <w14:lumMod w14:val="20000"/>
+                    <w14:lumOff w14:val="80000"/>
+                  </w14:schemeClr>
+                </w14:gs>
+              </w14:gsLst>
+              <w14:lin w14:ang="5400000" w14:scaled="0"/>
+            </w14:gradFill>
+          </w14:textFill>
+        </w:rPr>
+      </w:pPr>
+    </w:p>
+    <w:p>
+      <w:pPr>
+        <w:rPr>
+          <w:b/>
+          <w14:textOutline w14:w="12700" w14:cap="flat" w14:cmpd="sng" w14:algn="ctr">
+            <w14:solidFill>
+              <w14:schemeClr w14:val="accent4"/>
+            </w14:solidFill>
+            <w14:prstDash w14:val="solid"/>
+            <w14:round/>
+          </w14:textOutline>
+          <w14:textFill>
+            <w14:gradFill>
+              <w14:gsLst>
+                <w14:gs w14:pos="0">
+                  <w14:schemeClr w14:val="accent4"/>
+                </w14:gs>
+                <w14:gs w14:pos="4000">
+                  <w14:schemeClr w14:val="accent4">
+                    <w14:lumMod w14:val="60000"/>
+                    <w14:lumOff w14:val="40000"/>
+                  </w14:schemeClr>
+                </w14:gs>
+                <w14:gs w14:pos="87000">
+                  <w14:schemeClr w14:val="accent4">
+                    <w14:lumMod w14:val="20000"/>
+                    <w14:lumOff w14:val="80000"/>
+                  </w14:schemeClr>
+                </w14:gs>
+              </w14:gsLst>
+              <w14:lin w14:ang="5400000" w14:scaled="0"/>
+            </w14:gradFill>
+          </w14:textFill>
+        </w:rPr>
+      </w:pPr>
+    </w:p>
+    <w:p>
+      <w:pPr>
+        <w:rPr>
+          <w:b/>
+          <w14:textOutline w14:w="12700" w14:cap="flat" w14:cmpd="sng" w14:algn="ctr">
+            <w14:solidFill>
+              <w14:schemeClr w14:val="accent4"/>
+            </w14:solidFill>
+            <w14:prstDash w14:val="solid"/>
+            <w14:round/>
+          </w14:textOutline>
+          <w14:textFill>
+            <w14:gradFill>
+              <w14:gsLst>
+                <w14:gs w14:pos="0">
+                  <w14:schemeClr w14:val="accent4"/>
+                </w14:gs>
+                <w14:gs w14:pos="4000">
+                  <w14:schemeClr w14:val="accent4">
+                    <w14:lumMod w14:val="60000"/>
+                    <w14:lumOff w14:val="40000"/>
+                  </w14:schemeClr>
+                </w14:gs>
+                <w14:gs w14:pos="87000">
+                  <w14:schemeClr w14:val="accent4">
+                    <w14:lumMod w14:val="20000"/>
+                    <w14:lumOff w14:val="80000"/>
+                  </w14:schemeClr>
+                </w14:gs>
+              </w14:gsLst>
+              <w14:lin w14:ang="5400000" w14:scaled="0"/>
+            </w14:gradFill>
+          </w14:textFill>
+        </w:rPr>
+      </w:pPr>
+    </w:p>
+    <w:p>
+      <w:pPr>
+        <w:rPr>
+          <w:b/>
+          <w14:textOutline w14:w="12700" w14:cap="flat" w14:cmpd="sng" w14:algn="ctr">
+            <w14:solidFill>
+              <w14:schemeClr w14:val="accent4"/>
+            </w14:solidFill>
+            <w14:prstDash w14:val="solid"/>
+            <w14:round/>
+          </w14:textOutline>
+          <w14:textFill>
+            <w14:gradFill>
+              <w14:gsLst>
+                <w14:gs w14:pos="0">
+                  <w14:schemeClr w14:val="accent4"/>
+                </w14:gs>
+                <w14:gs w14:pos="4000">
+                  <w14:schemeClr w14:val="accent4">
+                    <w14:lumMod w14:val="60000"/>
+                    <w14:lumOff w14:val="40000"/>
+                  </w14:schemeClr>
+                </w14:gs>
+                <w14:gs w14:pos="87000">
+                  <w14:schemeClr w14:val="accent4">
+                    <w14:lumMod w14:val="20000"/>
+                    <w14:lumOff w14:val="80000"/>
+                  </w14:schemeClr>
+                </w14:gs>
+              </w14:gsLst>
+              <w14:lin w14:ang="5400000" w14:scaled="0"/>
+            </w14:gradFill>
+          </w14:textFill>
+        </w:rPr>
+      </w:pPr>
+    </w:p>
+    <w:p>
+      <w:pPr>
+        <w:rPr>
+          <w:b/>
+          <w14:textOutline w14:w="12700" w14:cap="flat" w14:cmpd="sng" w14:algn="ctr">
+            <w14:solidFill>
+              <w14:schemeClr w14:val="accent4"/>
+            </w14:solidFill>
+            <w14:prstDash w14:val="solid"/>
+            <w14:round/>
+          </w14:textOutline>
+          <w14:textFill>
+            <w14:gradFill>
+              <w14:gsLst>
+                <w14:gs w14:pos="0">
+                  <w14:schemeClr w14:val="accent4"/>
+                </w14:gs>
+                <w14:gs w14:pos="4000">
+                  <w14:schemeClr w14:val="accent4">
+                    <w14:lumMod w14:val="60000"/>
+                    <w14:lumOff w14:val="40000"/>
+                  </w14:schemeClr>
+                </w14:gs>
+                <w14:gs w14:pos="87000">
+                  <w14:schemeClr w14:val="accent4">
+                    <w14:lumMod w14:val="20000"/>
+                    <w14:lumOff w14:val="80000"/>
+                  </w14:schemeClr>
+                </w14:gs>
+              </w14:gsLst>
+              <w14:lin w14:ang="5400000" w14:scaled="0"/>
+            </w14:gradFill>
+          </w14:textFill>
+        </w:rPr>
+      </w:pPr>
+    </w:p>
+    <w:p>
+      <w:pPr>
+        <w:rPr>
+          <w:b/>
+          <w14:textOutline w14:w="12700" w14:cap="flat" w14:cmpd="sng" w14:algn="ctr">
+            <w14:solidFill>
+              <w14:schemeClr w14:val="accent4"/>
+            </w14:solidFill>
+            <w14:prstDash w14:val="solid"/>
+            <w14:round/>
+          </w14:textOutline>
+          <w14:textFill>
+            <w14:gradFill>
+              <w14:gsLst>
+                <w14:gs w14:pos="0">
+                  <w14:schemeClr w14:val="accent4"/>
+                </w14:gs>
+                <w14:gs w14:pos="4000">
+                  <w14:schemeClr w14:val="accent4">
+                    <w14:lumMod w14:val="60000"/>
+                    <w14:lumOff w14:val="40000"/>
+                  </w14:schemeClr>
+                </w14:gs>
+                <w14:gs w14:pos="87000">
+                  <w14:schemeClr w14:val="accent4">
+                    <w14:lumMod w14:val="20000"/>
+                    <w14:lumOff w14:val="80000"/>
+                  </w14:schemeClr>
+                </w14:gs>
+              </w14:gsLst>
+              <w14:lin w14:ang="5400000" w14:scaled="0"/>
+            </w14:gradFill>
+          </w14:textFill>
+        </w:rPr>
+      </w:pPr>
+    </w:p>
+    <w:p>
+      <w:pPr>
+        <w:rPr>
+          <w:b/>
+          <w14:textOutline w14:w="12700" w14:cap="flat" w14:cmpd="sng" w14:algn="ctr">
+            <w14:solidFill>
+              <w14:schemeClr w14:val="accent4"/>
+            </w14:solidFill>
+            <w14:prstDash w14:val="solid"/>
+            <w14:round/>
+          </w14:textOutline>
+          <w14:textFill>
+            <w14:gradFill>
+              <w14:gsLst>
+                <w14:gs w14:pos="0">
+                  <w14:schemeClr w14:val="accent4"/>
+                </w14:gs>
+                <w14:gs w14:pos="4000">
+                  <w14:schemeClr w14:val="accent4">
+                    <w14:lumMod w14:val="60000"/>
+                    <w14:lumOff w14:val="40000"/>
+                  </w14:schemeClr>
+                </w14:gs>
+                <w14:gs w14:pos="87000">
+                  <w14:schemeClr w14:val="accent4">
+                    <w14:lumMod w14:val="20000"/>
+                    <w14:lumOff w14:val="80000"/>
+                  </w14:schemeClr>
+                </w14:gs>
+              </w14:gsLst>
+              <w14:lin w14:ang="5400000" w14:scaled="0"/>
+            </w14:gradFill>
+          </w14:textFill>
+        </w:rPr>
+      </w:pPr>
+    </w:p>
+    <w:p>
+      <w:pPr>
+        <w:rPr>
+          <w:b/>
+          <w14:textOutline w14:w="12700" w14:cap="flat" w14:cmpd="sng" w14:algn="ctr">
+            <w14:solidFill>
+              <w14:schemeClr w14:val="accent4"/>
+            </w14:solidFill>
+            <w14:prstDash w14:val="solid"/>
+            <w14:round/>
+          </w14:textOutline>
+          <w14:textFill>
+            <w14:gradFill>
+              <w14:gsLst>
+                <w14:gs w14:pos="0">
+                  <w14:schemeClr w14:val="accent4"/>
+                </w14:gs>
+                <w14:gs w14:pos="4000">
+                  <w14:schemeClr w14:val="accent4">
+                    <w14:lumMod w14:val="60000"/>
+                    <w14:lumOff w14:val="40000"/>
+                  </w14:schemeClr>
+                </w14:gs>
+                <w14:gs w14:pos="87000">
+                  <w14:schemeClr w14:val="accent4">
+                    <w14:lumMod w14:val="20000"/>
+                    <w14:lumOff w14:val="80000"/>
+                  </w14:schemeClr>
+                </w14:gs>
+              </w14:gsLst>
+              <w14:lin w14:ang="5400000" w14:scaled="0"/>
+            </w14:gradFill>
+          </w14:textFill>
+        </w:rPr>
+      </w:pPr>
+    </w:p>
+    <w:p>
+      <w:pPr>
+        <w:rPr>
+          <w:b/>
+          <w14:textOutline w14:w="12700" w14:cap="flat" w14:cmpd="sng" w14:algn="ctr">
+            <w14:solidFill>
+              <w14:schemeClr w14:val="accent4"/>
+            </w14:solidFill>
+            <w14:prstDash w14:val="solid"/>
+            <w14:round/>
+          </w14:textOutline>
+          <w14:textFill>
+            <w14:gradFill>
+              <w14:gsLst>
+                <w14:gs w14:pos="0">
+                  <w14:schemeClr w14:val="accent4"/>
+                </w14:gs>
+                <w14:gs w14:pos="4000">
+                  <w14:schemeClr w14:val="accent4">
+                    <w14:lumMod w14:val="60000"/>
+                    <w14:lumOff w14:val="40000"/>
+                  </w14:schemeClr>
+                </w14:gs>
+                <w14:gs w14:pos="87000">
+                  <w14:schemeClr w14:val="accent4">
+                    <w14:lumMod w14:val="20000"/>
+                    <w14:lumOff w14:val="80000"/>
+                  </w14:schemeClr>
+                </w14:gs>
+              </w14:gsLst>
+              <w14:lin w14:ang="5400000" w14:scaled="0"/>
+            </w14:gradFill>
+          </w14:textFill>
+        </w:rPr>
+      </w:pPr>
+    </w:p>
+    <w:p>
+      <w:pPr>
+        <w:rPr>
+          <w:b/>
+          <w14:textOutline w14:w="12700" w14:cap="flat" w14:cmpd="sng" w14:algn="ctr">
+            <w14:solidFill>
+              <w14:schemeClr w14:val="accent4"/>
+            </w14:solidFill>
+            <w14:prstDash w14:val="solid"/>
+            <w14:round/>
+          </w14:textOutline>
+          <w14:textFill>
+            <w14:gradFill>
+              <w14:gsLst>
+                <w14:gs w14:pos="0">
+                  <w14:schemeClr w14:val="accent4"/>
+                </w14:gs>
+                <w14:gs w14:pos="4000">
+                  <w14:schemeClr w14:val="accent4">
+                    <w14:lumMod w14:val="60000"/>
+                    <w14:lumOff w14:val="40000"/>
+                  </w14:schemeClr>
+                </w14:gs>
+                <w14:gs w14:pos="87000">
+                  <w14:schemeClr w14:val="accent4">
+                    <w14:lumMod w14:val="20000"/>
+                    <w14:lumOff w14:val="80000"/>
+                  </w14:schemeClr>
+                </w14:gs>
+              </w14:gsLst>
+              <w14:lin w14:ang="5400000" w14:scaled="0"/>
+            </w14:gradFill>
+          </w14:textFill>
+        </w:rPr>
+      </w:pPr>
+      <w:r>
+        <w:rPr>
+          <w:b/>
+          <w14:textOutline w14:w="12700" w14:cap="flat" w14:cmpd="sng" w14:algn="ctr">
+            <w14:solidFill>
+              <w14:schemeClr w14:val="accent4"/>
+            </w14:solidFill>
+            <w14:prstDash w14:val="solid"/>
+            <w14:round/>
+          </w14:textOutline>
+          <w14:textFill>
+            <w14:gradFill>
+              <w14:gsLst>
+                <w14:gs w14:pos="0">
+                  <w14:schemeClr w14:val="accent4"/>
+                </w14:gs>
+                <w14:gs w14:pos="4000">
+                  <w14:schemeClr w14:val="accent4">
+                    <w14:lumMod w14:val="60000"/>
+                    <w14:lumOff w14:val="40000"/>
+                  </w14:schemeClr>
+                </w14:gs>
+                <w14:gs w14:pos="87000">
+                  <w14:schemeClr w14:val="accent4">
+                    <w14:lumMod w14:val="20000"/>
+                    <w14:lumOff w14:val="80000"/>
+                  </w14:schemeClr>
+                </w14:gs>
+              </w14:gsLst>
+              <w14:lin w14:ang="5400000" w14:scaled="0"/>
+            </w14:gradFill>
+          </w14:textFill>
+        </w:rPr>
         <w:t>Clientes</w:t>
       </w:r>
     </w:p>
-    <w:p/>
     <w:p>
       <w:r>
         <w:rPr>
@@ -26753,7 +28068,7 @@
                     <pic:cNvPicPr/>
                   </pic:nvPicPr>
                   <pic:blipFill>
-                    <a:blip r:embed="rId22">
+                    <a:blip r:embed="rId24">
                       <a:extLst>
                         <a:ext uri="{28A0092B-C50C-407E-A947-70E740481C1C}">
                           <a14:useLocalDpi xmlns:a14="http://schemas.microsoft.com/office/drawing/2010/main" val="0"/>
@@ -26779,8 +28094,903 @@
           </wp:anchor>
         </w:drawing>
       </w:r>
-      <w:r>
-        <w:br w:type="page"/>
+    </w:p>
+    <w:p>
+      <w:pPr>
+        <w:rPr>
+          <w:b/>
+          <w14:textOutline w14:w="12700" w14:cap="flat" w14:cmpd="sng" w14:algn="ctr">
+            <w14:solidFill>
+              <w14:schemeClr w14:val="accent4"/>
+            </w14:solidFill>
+            <w14:prstDash w14:val="solid"/>
+            <w14:round/>
+          </w14:textOutline>
+          <w14:textFill>
+            <w14:gradFill>
+              <w14:gsLst>
+                <w14:gs w14:pos="0">
+                  <w14:schemeClr w14:val="accent4"/>
+                </w14:gs>
+                <w14:gs w14:pos="4000">
+                  <w14:schemeClr w14:val="accent4">
+                    <w14:lumMod w14:val="60000"/>
+                    <w14:lumOff w14:val="40000"/>
+                  </w14:schemeClr>
+                </w14:gs>
+                <w14:gs w14:pos="87000">
+                  <w14:schemeClr w14:val="accent4">
+                    <w14:lumMod w14:val="20000"/>
+                    <w14:lumOff w14:val="80000"/>
+                  </w14:schemeClr>
+                </w14:gs>
+              </w14:gsLst>
+              <w14:lin w14:ang="5400000" w14:scaled="0"/>
+            </w14:gradFill>
+          </w14:textFill>
+        </w:rPr>
+      </w:pPr>
+    </w:p>
+    <w:p>
+      <w:pPr>
+        <w:rPr>
+          <w:b/>
+          <w14:textOutline w14:w="12700" w14:cap="flat" w14:cmpd="sng" w14:algn="ctr">
+            <w14:solidFill>
+              <w14:schemeClr w14:val="accent4"/>
+            </w14:solidFill>
+            <w14:prstDash w14:val="solid"/>
+            <w14:round/>
+          </w14:textOutline>
+          <w14:textFill>
+            <w14:gradFill>
+              <w14:gsLst>
+                <w14:gs w14:pos="0">
+                  <w14:schemeClr w14:val="accent4"/>
+                </w14:gs>
+                <w14:gs w14:pos="4000">
+                  <w14:schemeClr w14:val="accent4">
+                    <w14:lumMod w14:val="60000"/>
+                    <w14:lumOff w14:val="40000"/>
+                  </w14:schemeClr>
+                </w14:gs>
+                <w14:gs w14:pos="87000">
+                  <w14:schemeClr w14:val="accent4">
+                    <w14:lumMod w14:val="20000"/>
+                    <w14:lumOff w14:val="80000"/>
+                  </w14:schemeClr>
+                </w14:gs>
+              </w14:gsLst>
+              <w14:lin w14:ang="5400000" w14:scaled="0"/>
+            </w14:gradFill>
+          </w14:textFill>
+        </w:rPr>
+      </w:pPr>
+    </w:p>
+    <w:p>
+      <w:pPr>
+        <w:rPr>
+          <w:b/>
+          <w14:textOutline w14:w="12700" w14:cap="flat" w14:cmpd="sng" w14:algn="ctr">
+            <w14:solidFill>
+              <w14:schemeClr w14:val="accent4"/>
+            </w14:solidFill>
+            <w14:prstDash w14:val="solid"/>
+            <w14:round/>
+          </w14:textOutline>
+          <w14:textFill>
+            <w14:gradFill>
+              <w14:gsLst>
+                <w14:gs w14:pos="0">
+                  <w14:schemeClr w14:val="accent4"/>
+                </w14:gs>
+                <w14:gs w14:pos="4000">
+                  <w14:schemeClr w14:val="accent4">
+                    <w14:lumMod w14:val="60000"/>
+                    <w14:lumOff w14:val="40000"/>
+                  </w14:schemeClr>
+                </w14:gs>
+                <w14:gs w14:pos="87000">
+                  <w14:schemeClr w14:val="accent4">
+                    <w14:lumMod w14:val="20000"/>
+                    <w14:lumOff w14:val="80000"/>
+                  </w14:schemeClr>
+                </w14:gs>
+              </w14:gsLst>
+              <w14:lin w14:ang="5400000" w14:scaled="0"/>
+            </w14:gradFill>
+          </w14:textFill>
+        </w:rPr>
+      </w:pPr>
+    </w:p>
+    <w:p>
+      <w:pPr>
+        <w:rPr>
+          <w:b/>
+          <w14:textOutline w14:w="12700" w14:cap="flat" w14:cmpd="sng" w14:algn="ctr">
+            <w14:solidFill>
+              <w14:schemeClr w14:val="accent4"/>
+            </w14:solidFill>
+            <w14:prstDash w14:val="solid"/>
+            <w14:round/>
+          </w14:textOutline>
+          <w14:textFill>
+            <w14:gradFill>
+              <w14:gsLst>
+                <w14:gs w14:pos="0">
+                  <w14:schemeClr w14:val="accent4"/>
+                </w14:gs>
+                <w14:gs w14:pos="4000">
+                  <w14:schemeClr w14:val="accent4">
+                    <w14:lumMod w14:val="60000"/>
+                    <w14:lumOff w14:val="40000"/>
+                  </w14:schemeClr>
+                </w14:gs>
+                <w14:gs w14:pos="87000">
+                  <w14:schemeClr w14:val="accent4">
+                    <w14:lumMod w14:val="20000"/>
+                    <w14:lumOff w14:val="80000"/>
+                  </w14:schemeClr>
+                </w14:gs>
+              </w14:gsLst>
+              <w14:lin w14:ang="5400000" w14:scaled="0"/>
+            </w14:gradFill>
+          </w14:textFill>
+        </w:rPr>
+      </w:pPr>
+    </w:p>
+    <w:p>
+      <w:pPr>
+        <w:rPr>
+          <w:b/>
+          <w14:textOutline w14:w="12700" w14:cap="flat" w14:cmpd="sng" w14:algn="ctr">
+            <w14:solidFill>
+              <w14:schemeClr w14:val="accent4"/>
+            </w14:solidFill>
+            <w14:prstDash w14:val="solid"/>
+            <w14:round/>
+          </w14:textOutline>
+          <w14:textFill>
+            <w14:gradFill>
+              <w14:gsLst>
+                <w14:gs w14:pos="0">
+                  <w14:schemeClr w14:val="accent4"/>
+                </w14:gs>
+                <w14:gs w14:pos="4000">
+                  <w14:schemeClr w14:val="accent4">
+                    <w14:lumMod w14:val="60000"/>
+                    <w14:lumOff w14:val="40000"/>
+                  </w14:schemeClr>
+                </w14:gs>
+                <w14:gs w14:pos="87000">
+                  <w14:schemeClr w14:val="accent4">
+                    <w14:lumMod w14:val="20000"/>
+                    <w14:lumOff w14:val="80000"/>
+                  </w14:schemeClr>
+                </w14:gs>
+              </w14:gsLst>
+              <w14:lin w14:ang="5400000" w14:scaled="0"/>
+            </w14:gradFill>
+          </w14:textFill>
+        </w:rPr>
+      </w:pPr>
+    </w:p>
+    <w:p>
+      <w:pPr>
+        <w:rPr>
+          <w:b/>
+          <w14:textOutline w14:w="12700" w14:cap="flat" w14:cmpd="sng" w14:algn="ctr">
+            <w14:solidFill>
+              <w14:schemeClr w14:val="accent4"/>
+            </w14:solidFill>
+            <w14:prstDash w14:val="solid"/>
+            <w14:round/>
+          </w14:textOutline>
+          <w14:textFill>
+            <w14:gradFill>
+              <w14:gsLst>
+                <w14:gs w14:pos="0">
+                  <w14:schemeClr w14:val="accent4"/>
+                </w14:gs>
+                <w14:gs w14:pos="4000">
+                  <w14:schemeClr w14:val="accent4">
+                    <w14:lumMod w14:val="60000"/>
+                    <w14:lumOff w14:val="40000"/>
+                  </w14:schemeClr>
+                </w14:gs>
+                <w14:gs w14:pos="87000">
+                  <w14:schemeClr w14:val="accent4">
+                    <w14:lumMod w14:val="20000"/>
+                    <w14:lumOff w14:val="80000"/>
+                  </w14:schemeClr>
+                </w14:gs>
+              </w14:gsLst>
+              <w14:lin w14:ang="5400000" w14:scaled="0"/>
+            </w14:gradFill>
+          </w14:textFill>
+        </w:rPr>
+      </w:pPr>
+    </w:p>
+    <w:p>
+      <w:pPr>
+        <w:rPr>
+          <w:b/>
+          <w14:textOutline w14:w="12700" w14:cap="flat" w14:cmpd="sng" w14:algn="ctr">
+            <w14:solidFill>
+              <w14:schemeClr w14:val="accent4"/>
+            </w14:solidFill>
+            <w14:prstDash w14:val="solid"/>
+            <w14:round/>
+          </w14:textOutline>
+          <w14:textFill>
+            <w14:gradFill>
+              <w14:gsLst>
+                <w14:gs w14:pos="0">
+                  <w14:schemeClr w14:val="accent4"/>
+                </w14:gs>
+                <w14:gs w14:pos="4000">
+                  <w14:schemeClr w14:val="accent4">
+                    <w14:lumMod w14:val="60000"/>
+                    <w14:lumOff w14:val="40000"/>
+                  </w14:schemeClr>
+                </w14:gs>
+                <w14:gs w14:pos="87000">
+                  <w14:schemeClr w14:val="accent4">
+                    <w14:lumMod w14:val="20000"/>
+                    <w14:lumOff w14:val="80000"/>
+                  </w14:schemeClr>
+                </w14:gs>
+              </w14:gsLst>
+              <w14:lin w14:ang="5400000" w14:scaled="0"/>
+            </w14:gradFill>
+          </w14:textFill>
+        </w:rPr>
+      </w:pPr>
+    </w:p>
+    <w:p>
+      <w:pPr>
+        <w:rPr>
+          <w:b/>
+          <w14:textOutline w14:w="12700" w14:cap="flat" w14:cmpd="sng" w14:algn="ctr">
+            <w14:solidFill>
+              <w14:schemeClr w14:val="accent4"/>
+            </w14:solidFill>
+            <w14:prstDash w14:val="solid"/>
+            <w14:round/>
+          </w14:textOutline>
+          <w14:textFill>
+            <w14:gradFill>
+              <w14:gsLst>
+                <w14:gs w14:pos="0">
+                  <w14:schemeClr w14:val="accent4"/>
+                </w14:gs>
+                <w14:gs w14:pos="4000">
+                  <w14:schemeClr w14:val="accent4">
+                    <w14:lumMod w14:val="60000"/>
+                    <w14:lumOff w14:val="40000"/>
+                  </w14:schemeClr>
+                </w14:gs>
+                <w14:gs w14:pos="87000">
+                  <w14:schemeClr w14:val="accent4">
+                    <w14:lumMod w14:val="20000"/>
+                    <w14:lumOff w14:val="80000"/>
+                  </w14:schemeClr>
+                </w14:gs>
+              </w14:gsLst>
+              <w14:lin w14:ang="5400000" w14:scaled="0"/>
+            </w14:gradFill>
+          </w14:textFill>
+        </w:rPr>
+      </w:pPr>
+    </w:p>
+    <w:p>
+      <w:pPr>
+        <w:rPr>
+          <w:b/>
+          <w14:textOutline w14:w="12700" w14:cap="flat" w14:cmpd="sng" w14:algn="ctr">
+            <w14:solidFill>
+              <w14:schemeClr w14:val="accent4"/>
+            </w14:solidFill>
+            <w14:prstDash w14:val="solid"/>
+            <w14:round/>
+          </w14:textOutline>
+          <w14:textFill>
+            <w14:gradFill>
+              <w14:gsLst>
+                <w14:gs w14:pos="0">
+                  <w14:schemeClr w14:val="accent4"/>
+                </w14:gs>
+                <w14:gs w14:pos="4000">
+                  <w14:schemeClr w14:val="accent4">
+                    <w14:lumMod w14:val="60000"/>
+                    <w14:lumOff w14:val="40000"/>
+                  </w14:schemeClr>
+                </w14:gs>
+                <w14:gs w14:pos="87000">
+                  <w14:schemeClr w14:val="accent4">
+                    <w14:lumMod w14:val="20000"/>
+                    <w14:lumOff w14:val="80000"/>
+                  </w14:schemeClr>
+                </w14:gs>
+              </w14:gsLst>
+              <w14:lin w14:ang="5400000" w14:scaled="0"/>
+            </w14:gradFill>
+          </w14:textFill>
+        </w:rPr>
+      </w:pPr>
+    </w:p>
+    <w:p>
+      <w:pPr>
+        <w:rPr>
+          <w:b/>
+          <w14:textOutline w14:w="12700" w14:cap="flat" w14:cmpd="sng" w14:algn="ctr">
+            <w14:solidFill>
+              <w14:schemeClr w14:val="accent4"/>
+            </w14:solidFill>
+            <w14:prstDash w14:val="solid"/>
+            <w14:round/>
+          </w14:textOutline>
+          <w14:textFill>
+            <w14:gradFill>
+              <w14:gsLst>
+                <w14:gs w14:pos="0">
+                  <w14:schemeClr w14:val="accent4"/>
+                </w14:gs>
+                <w14:gs w14:pos="4000">
+                  <w14:schemeClr w14:val="accent4">
+                    <w14:lumMod w14:val="60000"/>
+                    <w14:lumOff w14:val="40000"/>
+                  </w14:schemeClr>
+                </w14:gs>
+                <w14:gs w14:pos="87000">
+                  <w14:schemeClr w14:val="accent4">
+                    <w14:lumMod w14:val="20000"/>
+                    <w14:lumOff w14:val="80000"/>
+                  </w14:schemeClr>
+                </w14:gs>
+              </w14:gsLst>
+              <w14:lin w14:ang="5400000" w14:scaled="0"/>
+            </w14:gradFill>
+          </w14:textFill>
+        </w:rPr>
+      </w:pPr>
+    </w:p>
+    <w:p>
+      <w:pPr>
+        <w:rPr>
+          <w:b/>
+          <w14:textOutline w14:w="12700" w14:cap="flat" w14:cmpd="sng" w14:algn="ctr">
+            <w14:solidFill>
+              <w14:schemeClr w14:val="accent4"/>
+            </w14:solidFill>
+            <w14:prstDash w14:val="solid"/>
+            <w14:round/>
+          </w14:textOutline>
+          <w14:textFill>
+            <w14:gradFill>
+              <w14:gsLst>
+                <w14:gs w14:pos="0">
+                  <w14:schemeClr w14:val="accent4"/>
+                </w14:gs>
+                <w14:gs w14:pos="4000">
+                  <w14:schemeClr w14:val="accent4">
+                    <w14:lumMod w14:val="60000"/>
+                    <w14:lumOff w14:val="40000"/>
+                  </w14:schemeClr>
+                </w14:gs>
+                <w14:gs w14:pos="87000">
+                  <w14:schemeClr w14:val="accent4">
+                    <w14:lumMod w14:val="20000"/>
+                    <w14:lumOff w14:val="80000"/>
+                  </w14:schemeClr>
+                </w14:gs>
+              </w14:gsLst>
+              <w14:lin w14:ang="5400000" w14:scaled="0"/>
+            </w14:gradFill>
+          </w14:textFill>
+        </w:rPr>
+      </w:pPr>
+    </w:p>
+    <w:p>
+      <w:pPr>
+        <w:rPr>
+          <w:b/>
+          <w14:textOutline w14:w="12700" w14:cap="flat" w14:cmpd="sng" w14:algn="ctr">
+            <w14:solidFill>
+              <w14:schemeClr w14:val="accent4"/>
+            </w14:solidFill>
+            <w14:prstDash w14:val="solid"/>
+            <w14:round/>
+          </w14:textOutline>
+          <w14:textFill>
+            <w14:gradFill>
+              <w14:gsLst>
+                <w14:gs w14:pos="0">
+                  <w14:schemeClr w14:val="accent4"/>
+                </w14:gs>
+                <w14:gs w14:pos="4000">
+                  <w14:schemeClr w14:val="accent4">
+                    <w14:lumMod w14:val="60000"/>
+                    <w14:lumOff w14:val="40000"/>
+                  </w14:schemeClr>
+                </w14:gs>
+                <w14:gs w14:pos="87000">
+                  <w14:schemeClr w14:val="accent4">
+                    <w14:lumMod w14:val="20000"/>
+                    <w14:lumOff w14:val="80000"/>
+                  </w14:schemeClr>
+                </w14:gs>
+              </w14:gsLst>
+              <w14:lin w14:ang="5400000" w14:scaled="0"/>
+            </w14:gradFill>
+          </w14:textFill>
+        </w:rPr>
+      </w:pPr>
+    </w:p>
+    <w:p>
+      <w:pPr>
+        <w:rPr>
+          <w:b/>
+          <w14:textOutline w14:w="12700" w14:cap="flat" w14:cmpd="sng" w14:algn="ctr">
+            <w14:solidFill>
+              <w14:schemeClr w14:val="accent4"/>
+            </w14:solidFill>
+            <w14:prstDash w14:val="solid"/>
+            <w14:round/>
+          </w14:textOutline>
+          <w14:textFill>
+            <w14:gradFill>
+              <w14:gsLst>
+                <w14:gs w14:pos="0">
+                  <w14:schemeClr w14:val="accent4"/>
+                </w14:gs>
+                <w14:gs w14:pos="4000">
+                  <w14:schemeClr w14:val="accent4">
+                    <w14:lumMod w14:val="60000"/>
+                    <w14:lumOff w14:val="40000"/>
+                  </w14:schemeClr>
+                </w14:gs>
+                <w14:gs w14:pos="87000">
+                  <w14:schemeClr w14:val="accent4">
+                    <w14:lumMod w14:val="20000"/>
+                    <w14:lumOff w14:val="80000"/>
+                  </w14:schemeClr>
+                </w14:gs>
+              </w14:gsLst>
+              <w14:lin w14:ang="5400000" w14:scaled="0"/>
+            </w14:gradFill>
+          </w14:textFill>
+        </w:rPr>
+      </w:pPr>
+    </w:p>
+    <w:p>
+      <w:pPr>
+        <w:rPr>
+          <w:b/>
+          <w14:textOutline w14:w="12700" w14:cap="flat" w14:cmpd="sng" w14:algn="ctr">
+            <w14:solidFill>
+              <w14:schemeClr w14:val="accent4"/>
+            </w14:solidFill>
+            <w14:prstDash w14:val="solid"/>
+            <w14:round/>
+          </w14:textOutline>
+          <w14:textFill>
+            <w14:gradFill>
+              <w14:gsLst>
+                <w14:gs w14:pos="0">
+                  <w14:schemeClr w14:val="accent4"/>
+                </w14:gs>
+                <w14:gs w14:pos="4000">
+                  <w14:schemeClr w14:val="accent4">
+                    <w14:lumMod w14:val="60000"/>
+                    <w14:lumOff w14:val="40000"/>
+                  </w14:schemeClr>
+                </w14:gs>
+                <w14:gs w14:pos="87000">
+                  <w14:schemeClr w14:val="accent4">
+                    <w14:lumMod w14:val="20000"/>
+                    <w14:lumOff w14:val="80000"/>
+                  </w14:schemeClr>
+                </w14:gs>
+              </w14:gsLst>
+              <w14:lin w14:ang="5400000" w14:scaled="0"/>
+            </w14:gradFill>
+          </w14:textFill>
+        </w:rPr>
+      </w:pPr>
+    </w:p>
+    <w:p>
+      <w:pPr>
+        <w:rPr>
+          <w:b/>
+          <w14:textOutline w14:w="12700" w14:cap="flat" w14:cmpd="sng" w14:algn="ctr">
+            <w14:solidFill>
+              <w14:schemeClr w14:val="accent4"/>
+            </w14:solidFill>
+            <w14:prstDash w14:val="solid"/>
+            <w14:round/>
+          </w14:textOutline>
+          <w14:textFill>
+            <w14:gradFill>
+              <w14:gsLst>
+                <w14:gs w14:pos="0">
+                  <w14:schemeClr w14:val="accent4"/>
+                </w14:gs>
+                <w14:gs w14:pos="4000">
+                  <w14:schemeClr w14:val="accent4">
+                    <w14:lumMod w14:val="60000"/>
+                    <w14:lumOff w14:val="40000"/>
+                  </w14:schemeClr>
+                </w14:gs>
+                <w14:gs w14:pos="87000">
+                  <w14:schemeClr w14:val="accent4">
+                    <w14:lumMod w14:val="20000"/>
+                    <w14:lumOff w14:val="80000"/>
+                  </w14:schemeClr>
+                </w14:gs>
+              </w14:gsLst>
+              <w14:lin w14:ang="5400000" w14:scaled="0"/>
+            </w14:gradFill>
+          </w14:textFill>
+        </w:rPr>
+      </w:pPr>
+    </w:p>
+    <w:p>
+      <w:pPr>
+        <w:rPr>
+          <w:b/>
+          <w14:textOutline w14:w="12700" w14:cap="flat" w14:cmpd="sng" w14:algn="ctr">
+            <w14:solidFill>
+              <w14:schemeClr w14:val="accent4"/>
+            </w14:solidFill>
+            <w14:prstDash w14:val="solid"/>
+            <w14:round/>
+          </w14:textOutline>
+          <w14:textFill>
+            <w14:gradFill>
+              <w14:gsLst>
+                <w14:gs w14:pos="0">
+                  <w14:schemeClr w14:val="accent4"/>
+                </w14:gs>
+                <w14:gs w14:pos="4000">
+                  <w14:schemeClr w14:val="accent4">
+                    <w14:lumMod w14:val="60000"/>
+                    <w14:lumOff w14:val="40000"/>
+                  </w14:schemeClr>
+                </w14:gs>
+                <w14:gs w14:pos="87000">
+                  <w14:schemeClr w14:val="accent4">
+                    <w14:lumMod w14:val="20000"/>
+                    <w14:lumOff w14:val="80000"/>
+                  </w14:schemeClr>
+                </w14:gs>
+              </w14:gsLst>
+              <w14:lin w14:ang="5400000" w14:scaled="0"/>
+            </w14:gradFill>
+          </w14:textFill>
+        </w:rPr>
+      </w:pPr>
+    </w:p>
+    <w:p>
+      <w:pPr>
+        <w:rPr>
+          <w:b/>
+          <w14:textOutline w14:w="12700" w14:cap="flat" w14:cmpd="sng" w14:algn="ctr">
+            <w14:solidFill>
+              <w14:schemeClr w14:val="accent4"/>
+            </w14:solidFill>
+            <w14:prstDash w14:val="solid"/>
+            <w14:round/>
+          </w14:textOutline>
+          <w14:textFill>
+            <w14:gradFill>
+              <w14:gsLst>
+                <w14:gs w14:pos="0">
+                  <w14:schemeClr w14:val="accent4"/>
+                </w14:gs>
+                <w14:gs w14:pos="4000">
+                  <w14:schemeClr w14:val="accent4">
+                    <w14:lumMod w14:val="60000"/>
+                    <w14:lumOff w14:val="40000"/>
+                  </w14:schemeClr>
+                </w14:gs>
+                <w14:gs w14:pos="87000">
+                  <w14:schemeClr w14:val="accent4">
+                    <w14:lumMod w14:val="20000"/>
+                    <w14:lumOff w14:val="80000"/>
+                  </w14:schemeClr>
+                </w14:gs>
+              </w14:gsLst>
+              <w14:lin w14:ang="5400000" w14:scaled="0"/>
+            </w14:gradFill>
+          </w14:textFill>
+        </w:rPr>
+      </w:pPr>
+    </w:p>
+    <w:p>
+      <w:pPr>
+        <w:rPr>
+          <w:b/>
+          <w14:textOutline w14:w="12700" w14:cap="flat" w14:cmpd="sng" w14:algn="ctr">
+            <w14:solidFill>
+              <w14:schemeClr w14:val="accent4"/>
+            </w14:solidFill>
+            <w14:prstDash w14:val="solid"/>
+            <w14:round/>
+          </w14:textOutline>
+          <w14:textFill>
+            <w14:gradFill>
+              <w14:gsLst>
+                <w14:gs w14:pos="0">
+                  <w14:schemeClr w14:val="accent4"/>
+                </w14:gs>
+                <w14:gs w14:pos="4000">
+                  <w14:schemeClr w14:val="accent4">
+                    <w14:lumMod w14:val="60000"/>
+                    <w14:lumOff w14:val="40000"/>
+                  </w14:schemeClr>
+                </w14:gs>
+                <w14:gs w14:pos="87000">
+                  <w14:schemeClr w14:val="accent4">
+                    <w14:lumMod w14:val="20000"/>
+                    <w14:lumOff w14:val="80000"/>
+                  </w14:schemeClr>
+                </w14:gs>
+              </w14:gsLst>
+              <w14:lin w14:ang="5400000" w14:scaled="0"/>
+            </w14:gradFill>
+          </w14:textFill>
+        </w:rPr>
+      </w:pPr>
+    </w:p>
+    <w:p>
+      <w:pPr>
+        <w:rPr>
+          <w:b/>
+          <w14:textOutline w14:w="12700" w14:cap="flat" w14:cmpd="sng" w14:algn="ctr">
+            <w14:solidFill>
+              <w14:schemeClr w14:val="accent4"/>
+            </w14:solidFill>
+            <w14:prstDash w14:val="solid"/>
+            <w14:round/>
+          </w14:textOutline>
+          <w14:textFill>
+            <w14:gradFill>
+              <w14:gsLst>
+                <w14:gs w14:pos="0">
+                  <w14:schemeClr w14:val="accent4"/>
+                </w14:gs>
+                <w14:gs w14:pos="4000">
+                  <w14:schemeClr w14:val="accent4">
+                    <w14:lumMod w14:val="60000"/>
+                    <w14:lumOff w14:val="40000"/>
+                  </w14:schemeClr>
+                </w14:gs>
+                <w14:gs w14:pos="87000">
+                  <w14:schemeClr w14:val="accent4">
+                    <w14:lumMod w14:val="20000"/>
+                    <w14:lumOff w14:val="80000"/>
+                  </w14:schemeClr>
+                </w14:gs>
+              </w14:gsLst>
+              <w14:lin w14:ang="5400000" w14:scaled="0"/>
+            </w14:gradFill>
+          </w14:textFill>
+        </w:rPr>
+      </w:pPr>
+    </w:p>
+    <w:p>
+      <w:pPr>
+        <w:rPr>
+          <w:b/>
+          <w14:textOutline w14:w="12700" w14:cap="flat" w14:cmpd="sng" w14:algn="ctr">
+            <w14:solidFill>
+              <w14:schemeClr w14:val="accent4"/>
+            </w14:solidFill>
+            <w14:prstDash w14:val="solid"/>
+            <w14:round/>
+          </w14:textOutline>
+          <w14:textFill>
+            <w14:gradFill>
+              <w14:gsLst>
+                <w14:gs w14:pos="0">
+                  <w14:schemeClr w14:val="accent4"/>
+                </w14:gs>
+                <w14:gs w14:pos="4000">
+                  <w14:schemeClr w14:val="accent4">
+                    <w14:lumMod w14:val="60000"/>
+                    <w14:lumOff w14:val="40000"/>
+                  </w14:schemeClr>
+                </w14:gs>
+                <w14:gs w14:pos="87000">
+                  <w14:schemeClr w14:val="accent4">
+                    <w14:lumMod w14:val="20000"/>
+                    <w14:lumOff w14:val="80000"/>
+                  </w14:schemeClr>
+                </w14:gs>
+              </w14:gsLst>
+              <w14:lin w14:ang="5400000" w14:scaled="0"/>
+            </w14:gradFill>
+          </w14:textFill>
+        </w:rPr>
+      </w:pPr>
+      <w:r>
+        <w:rPr>
+          <w:b/>
+          <w14:textOutline w14:w="12700" w14:cap="flat" w14:cmpd="sng" w14:algn="ctr">
+            <w14:solidFill>
+              <w14:schemeClr w14:val="accent4"/>
+            </w14:solidFill>
+            <w14:prstDash w14:val="solid"/>
+            <w14:round/>
+          </w14:textOutline>
+          <w14:textFill>
+            <w14:gradFill>
+              <w14:gsLst>
+                <w14:gs w14:pos="0">
+                  <w14:schemeClr w14:val="accent4"/>
+                </w14:gs>
+                <w14:gs w14:pos="4000">
+                  <w14:schemeClr w14:val="accent4">
+                    <w14:lumMod w14:val="60000"/>
+                    <w14:lumOff w14:val="40000"/>
+                  </w14:schemeClr>
+                </w14:gs>
+                <w14:gs w14:pos="87000">
+                  <w14:schemeClr w14:val="accent4">
+                    <w14:lumMod w14:val="20000"/>
+                    <w14:lumOff w14:val="80000"/>
+                  </w14:schemeClr>
+                </w14:gs>
+              </w14:gsLst>
+              <w14:lin w14:ang="5400000" w14:scaled="0"/>
+            </w14:gradFill>
+          </w14:textFill>
+        </w:rPr>
+        <w:lastRenderedPageBreak/>
+        <w:t>Cadastro Cliente</w:t>
+      </w:r>
+    </w:p>
+    <w:p>
+      <w:pPr>
+        <w:rPr>
+          <w:b/>
+          <w14:textOutline w14:w="12700" w14:cap="flat" w14:cmpd="sng" w14:algn="ctr">
+            <w14:solidFill>
+              <w14:schemeClr w14:val="accent4"/>
+            </w14:solidFill>
+            <w14:prstDash w14:val="solid"/>
+            <w14:round/>
+          </w14:textOutline>
+          <w14:textFill>
+            <w14:gradFill>
+              <w14:gsLst>
+                <w14:gs w14:pos="0">
+                  <w14:schemeClr w14:val="accent4"/>
+                </w14:gs>
+                <w14:gs w14:pos="4000">
+                  <w14:schemeClr w14:val="accent4">
+                    <w14:lumMod w14:val="60000"/>
+                    <w14:lumOff w14:val="40000"/>
+                  </w14:schemeClr>
+                </w14:gs>
+                <w14:gs w14:pos="87000">
+                  <w14:schemeClr w14:val="accent4">
+                    <w14:lumMod w14:val="20000"/>
+                    <w14:lumOff w14:val="80000"/>
+                  </w14:schemeClr>
+                </w14:gs>
+              </w14:gsLst>
+              <w14:lin w14:ang="5400000" w14:scaled="0"/>
+            </w14:gradFill>
+          </w14:textFill>
+        </w:rPr>
+      </w:pPr>
+    </w:p>
+    <w:p>
+      <w:pPr>
+        <w:rPr>
+          <w:b/>
+          <w14:textOutline w14:w="12700" w14:cap="flat" w14:cmpd="sng" w14:algn="ctr">
+            <w14:solidFill>
+              <w14:schemeClr w14:val="accent4"/>
+            </w14:solidFill>
+            <w14:prstDash w14:val="solid"/>
+            <w14:round/>
+          </w14:textOutline>
+          <w14:textFill>
+            <w14:gradFill>
+              <w14:gsLst>
+                <w14:gs w14:pos="0">
+                  <w14:schemeClr w14:val="accent4"/>
+                </w14:gs>
+                <w14:gs w14:pos="4000">
+                  <w14:schemeClr w14:val="accent4">
+                    <w14:lumMod w14:val="60000"/>
+                    <w14:lumOff w14:val="40000"/>
+                  </w14:schemeClr>
+                </w14:gs>
+                <w14:gs w14:pos="87000">
+                  <w14:schemeClr w14:val="accent4">
+                    <w14:lumMod w14:val="20000"/>
+                    <w14:lumOff w14:val="80000"/>
+                  </w14:schemeClr>
+                </w14:gs>
+              </w14:gsLst>
+              <w14:lin w14:ang="5400000" w14:scaled="0"/>
+            </w14:gradFill>
+          </w14:textFill>
+        </w:rPr>
+      </w:pPr>
+      <w:r>
+        <w:rPr>
+          <w:b/>
+          <w:noProof/>
+          <w14:textOutline w14:w="12700" w14:cap="flat" w14:cmpd="sng" w14:algn="ctr">
+            <w14:solidFill>
+              <w14:schemeClr w14:val="accent4"/>
+            </w14:solidFill>
+            <w14:prstDash w14:val="solid"/>
+            <w14:round/>
+          </w14:textOutline>
+          <w14:textFill>
+            <w14:gradFill>
+              <w14:gsLst>
+                <w14:gs w14:pos="0">
+                  <w14:schemeClr w14:val="accent4"/>
+                </w14:gs>
+                <w14:gs w14:pos="4000">
+                  <w14:schemeClr w14:val="accent4">
+                    <w14:lumMod w14:val="60000"/>
+                    <w14:lumOff w14:val="40000"/>
+                  </w14:schemeClr>
+                </w14:gs>
+                <w14:gs w14:pos="87000">
+                  <w14:schemeClr w14:val="accent4">
+                    <w14:lumMod w14:val="20000"/>
+                    <w14:lumOff w14:val="80000"/>
+                  </w14:schemeClr>
+                </w14:gs>
+              </w14:gsLst>
+              <w14:lin w14:ang="5400000" w14:scaled="0"/>
+            </w14:gradFill>
+          </w14:textFill>
+        </w:rPr>
+        <w:drawing>
+          <wp:inline distT="0" distB="0" distL="0" distR="0" wp14:anchorId="454E7C13" wp14:editId="4541C0A1">
+            <wp:extent cx="5733415" cy="4070350"/>
+            <wp:effectExtent l="0" t="0" r="635" b="6350"/>
+            <wp:docPr id="13" name="Imagem 13"/>
+            <wp:cNvGraphicFramePr>
+              <a:graphicFrameLocks xmlns:a="http://schemas.openxmlformats.org/drawingml/2006/main" noChangeAspect="1"/>
+            </wp:cNvGraphicFramePr>
+            <a:graphic xmlns:a="http://schemas.openxmlformats.org/drawingml/2006/main">
+              <a:graphicData uri="http://schemas.openxmlformats.org/drawingml/2006/picture">
+                <pic:pic xmlns:pic="http://schemas.openxmlformats.org/drawingml/2006/picture">
+                  <pic:nvPicPr>
+                    <pic:cNvPr id="1" name=""/>
+                    <pic:cNvPicPr/>
+                  </pic:nvPicPr>
+                  <pic:blipFill>
+                    <a:blip r:embed="rId25"/>
+                    <a:stretch>
+                      <a:fillRect/>
+                    </a:stretch>
+                  </pic:blipFill>
+                  <pic:spPr>
+                    <a:xfrm>
+                      <a:off x="0" y="0"/>
+                      <a:ext cx="5733415" cy="4070350"/>
+                    </a:xfrm>
+                    <a:prstGeom prst="rect">
+                      <a:avLst/>
+                    </a:prstGeom>
+                  </pic:spPr>
+                </pic:pic>
+              </a:graphicData>
+            </a:graphic>
+          </wp:inline>
+        </w:drawing>
       </w:r>
     </w:p>
     <w:p>
@@ -26790,10 +29000,86 @@
     </w:p>
     <w:p>
       <w:pPr>
+        <w:pStyle w:val="PargrafodaLista"/>
+      </w:pPr>
+    </w:p>
+    <w:p>
+      <w:pPr>
+        <w:pStyle w:val="PargrafodaLista"/>
+      </w:pPr>
+    </w:p>
+    <w:p>
+      <w:pPr>
+        <w:pStyle w:val="PargrafodaLista"/>
+      </w:pPr>
+    </w:p>
+    <w:p>
+      <w:pPr>
+        <w:pStyle w:val="PargrafodaLista"/>
+      </w:pPr>
+    </w:p>
+    <w:p>
+      <w:pPr>
+        <w:pStyle w:val="PargrafodaLista"/>
+      </w:pPr>
+    </w:p>
+    <w:p>
+      <w:pPr>
+        <w:pStyle w:val="PargrafodaLista"/>
+      </w:pPr>
+    </w:p>
+    <w:p>
+      <w:pPr>
+        <w:pStyle w:val="PargrafodaLista"/>
+      </w:pPr>
+    </w:p>
+    <w:p>
+      <w:pPr>
+        <w:pStyle w:val="PargrafodaLista"/>
+      </w:pPr>
+    </w:p>
+    <w:p>
+      <w:pPr>
+        <w:pStyle w:val="PargrafodaLista"/>
+      </w:pPr>
+    </w:p>
+    <w:p>
+      <w:pPr>
+        <w:pStyle w:val="PargrafodaLista"/>
+      </w:pPr>
+    </w:p>
+    <w:p>
+      <w:pPr>
+        <w:pStyle w:val="PargrafodaLista"/>
+      </w:pPr>
+    </w:p>
+    <w:p>
+      <w:pPr>
+        <w:pStyle w:val="PargrafodaLista"/>
+      </w:pPr>
+    </w:p>
+    <w:p>
+      <w:pPr>
+        <w:pStyle w:val="PargrafodaLista"/>
+      </w:pPr>
+    </w:p>
+    <w:p>
+      <w:pPr>
+        <w:pStyle w:val="PargrafodaLista"/>
+      </w:pPr>
+    </w:p>
+    <w:p>
+      <w:pPr>
+        <w:pStyle w:val="PargrafodaLista"/>
+      </w:pPr>
+    </w:p>
+    <w:p>
+      <w:pPr>
         <w:pStyle w:val="Ttulo1"/>
       </w:pPr>
       <w:bookmarkStart w:id="33" w:name="_Toc208341112"/>
       <w:r>
+        <w:lastRenderedPageBreak/>
         <w:t>Testes e Qualidade</w:t>
       </w:r>
       <w:bookmarkEnd w:id="33"/>
@@ -28976,7 +31262,6 @@
       </w:r>
       <w:bookmarkEnd w:id="53"/>
     </w:p>
-    <w:p/>
     <w:p>
       <w:pPr>
         <w:pStyle w:val="NormalWeb"/>
@@ -29043,7 +31328,19 @@
         <w:rPr>
           <w:rFonts w:ascii="Arial" w:hAnsi="Arial" w:cs="Arial"/>
         </w:rPr>
-        <w:t>. A integração entre as partes do sistema permitiu que o Mainteer oferecesse funcionalidades como cadastro, edição, consulta e exclusão de informações — mantendo consistência, organização e facilidade de uso.</w:t>
+        <w:t>. A integração entre as partes do sistema permitiu que o Mainteer oferecesse funcionalidades como cadastro, edição, cons</w:t>
+      </w:r>
+      <w:r>
+        <w:rPr>
+          <w:rFonts w:ascii="Arial" w:hAnsi="Arial" w:cs="Arial"/>
+        </w:rPr>
+        <w:t>ulta e exclusão de informações,</w:t>
+      </w:r>
+      <w:r>
+        <w:rPr>
+          <w:rFonts w:ascii="Arial" w:hAnsi="Arial" w:cs="Arial"/>
+        </w:rPr>
+        <w:t xml:space="preserve"> mantendo consistência, organização e facilidade de uso.</w:t>
       </w:r>
     </w:p>
     <w:p>
@@ -29264,7 +31561,6 @@
           <w:sz w:val="24"/>
           <w:szCs w:val="24"/>
         </w:rPr>
-        <w:lastRenderedPageBreak/>
         <w:t>Beatriz Martins:</w:t>
       </w:r>
     </w:p>
@@ -29316,6 +31612,7 @@
         <w:rPr>
           <w:rFonts w:ascii="Arial" w:hAnsi="Arial" w:cs="Arial"/>
         </w:rPr>
+        <w:lastRenderedPageBreak/>
         <w:t xml:space="preserve">Desenvolveu o </w:t>
       </w:r>
       <w:r>
@@ -29641,6 +31938,15 @@
     </w:p>
     <w:p>
       <w:pPr>
+        <w:pStyle w:val="NormalWeb"/>
+        <w:jc w:val="both"/>
+        <w:rPr>
+          <w:rFonts w:ascii="Arial" w:hAnsi="Arial" w:cs="Arial"/>
+        </w:rPr>
+      </w:pPr>
+    </w:p>
+    <w:p>
+      <w:pPr>
         <w:pStyle w:val="Ttulo3"/>
         <w:rPr>
           <w:sz w:val="24"/>
@@ -29755,23 +32061,21 @@
       </w:r>
     </w:p>
     <w:p/>
-    <w:p>
-      <w:pPr>
-        <w:pStyle w:val="Ttulo1"/>
-      </w:pPr>
-      <w:bookmarkStart w:id="54" w:name="_Toc208341119"/>
-      <w:r>
-        <w:t>Referências</w:t>
-      </w:r>
-      <w:bookmarkEnd w:id="54"/>
-      <w:r>
-        <w:t xml:space="preserve"> </w:t>
-      </w:r>
-      <w:bookmarkStart w:id="55" w:name="_GoBack"/>
-      <w:bookmarkEnd w:id="55"/>
-    </w:p>
     <w:p/>
     <w:p/>
+    <w:p/>
+    <w:p/>
+    <w:p>
+      <w:pPr>
+        <w:pStyle w:val="Ttulo1"/>
+      </w:pPr>
+      <w:bookmarkStart w:id="54" w:name="_Toc208341119"/>
+      <w:r>
+        <w:lastRenderedPageBreak/>
+        <w:t>Referências</w:t>
+      </w:r>
+      <w:bookmarkEnd w:id="54"/>
+    </w:p>
     <w:p>
       <w:pPr>
         <w:pStyle w:val="Ttulo1"/>
@@ -29781,15 +32085,14 @@
         </w:numPr>
         <w:ind w:left="710"/>
       </w:pPr>
-      <w:bookmarkStart w:id="56" w:name="_Toc208341120"/>
-      <w:r>
-        <w:lastRenderedPageBreak/>
+      <w:bookmarkStart w:id="55" w:name="_Toc208341120"/>
+      <w:r>
         <w:t xml:space="preserve">Anexo I - </w:t>
       </w:r>
       <w:r>
         <w:t>Diário de bordo</w:t>
       </w:r>
-      <w:bookmarkEnd w:id="56"/>
+      <w:bookmarkEnd w:id="55"/>
     </w:p>
     <w:p>
       <w:r>
@@ -29809,14 +32112,19 @@
       <w:r>
         <w:t xml:space="preserve"> </w:t>
       </w:r>
-      <w:hyperlink r:id="rId23" w:history="1">
-        <w:r>
-          <w:rPr>
-            <w:rStyle w:val="Hyperlink"/>
-          </w:rPr>
-          <w:t>Diário de Bordo - Mainteer</w:t>
-        </w:r>
-      </w:hyperlink>
+      <w:r>
+        <w:t xml:space="preserve">Diário de Bordo </w:t>
+      </w:r>
+      <w:r>
+        <w:t>–</w:t>
+      </w:r>
+      <w:r>
+        <w:t xml:space="preserve"> Mainteer</w:t>
+      </w:r>
+    </w:p>
+    <w:p>
+      <w:bookmarkStart w:id="56" w:name="_GoBack"/>
+      <w:bookmarkEnd w:id="56"/>
     </w:p>
     <w:p>
       <w:r>
@@ -29855,7 +32163,7 @@
     </w:p>
     <w:p>
       <w:r>
-        <w:t xml:space="preserve">Beatriz Martins: </w:t>
+        <w:t>Beatriz Martins:</w:t>
       </w:r>
     </w:p>
     <w:p>
@@ -29913,7 +32221,7 @@
       </w:r>
     </w:p>
     <w:sectPr>
-      <w:headerReference w:type="default" r:id="rId24"/>
+      <w:headerReference w:type="default" r:id="rId26"/>
       <w:pgSz w:w="11909" w:h="16834"/>
       <w:pgMar w:top="1440" w:right="1440" w:bottom="1440" w:left="1440" w:header="720" w:footer="720" w:gutter="0"/>
       <w:pgNumType w:start="1"/>
@@ -36476,8 +38784,8 @@
       <w:bCs/>
     </w:rPr>
   </w:style>
-  <w:style w:type="character" w:customStyle="1" w:styleId="UnresolvedMention">
-    <w:name w:val="Unresolved Mention"/>
+  <w:style w:type="character" w:customStyle="1" w:styleId="MenoPendente1">
+    <w:name w:val="Menção Pendente1"/>
     <w:basedOn w:val="Fontepargpadro"/>
     <w:uiPriority w:val="99"/>
     <w:semiHidden/>
@@ -36828,8 +39136,9 @@
     <w:panose1 w:val="020B0502040204020203"/>
     <w:charset w:val="00"/>
     <w:family w:val="swiss"/>
+    <w:notTrueType/>
     <w:pitch w:val="variable"/>
-    <w:sig w:usb0="E4002EFF" w:usb1="C000E47F" w:usb2="00000009" w:usb3="00000000" w:csb0="000001FF" w:csb1="00000000"/>
+    <w:sig w:usb0="00000003" w:usb1="00000000" w:usb2="00000000" w:usb3="00000000" w:csb0="00000001" w:csb1="00000000"/>
   </w:font>
   <w:font w:name="Verdana">
     <w:panose1 w:val="020B0604030504040204"/>
@@ -36864,12 +39173,12 @@
   </w:compat>
   <w:rsids>
     <w:rsidRoot w:val="00B855D3"/>
+    <w:rsid w:val="00045E5E"/>
     <w:rsid w:val="0007059E"/>
     <w:rsid w:val="00082FB4"/>
     <w:rsid w:val="00085478"/>
     <w:rsid w:val="000E6660"/>
     <w:rsid w:val="001109B3"/>
-    <w:rsid w:val="001246EB"/>
     <w:rsid w:val="001E376C"/>
     <w:rsid w:val="002105CC"/>
     <w:rsid w:val="00247922"/>
@@ -36892,12 +39201,12 @@
     <w:rsid w:val="009C592D"/>
     <w:rsid w:val="009E2C52"/>
     <w:rsid w:val="009F3907"/>
+    <w:rsid w:val="00A5748B"/>
     <w:rsid w:val="00AC7CE5"/>
     <w:rsid w:val="00B06368"/>
     <w:rsid w:val="00B855D3"/>
     <w:rsid w:val="00CA365F"/>
     <w:rsid w:val="00CE18D8"/>
-    <w:rsid w:val="00E2254B"/>
     <w:rsid w:val="00E229EC"/>
     <w:rsid w:val="00E42A26"/>
     <w:rsid w:val="00EA756E"/>
@@ -37991,7 +40300,7 @@
 </file>
 
 <file path=customXml/itemProps4.xml><?xml version="1.0" encoding="utf-8"?>
-<ds:datastoreItem xmlns:ds="http://schemas.openxmlformats.org/officeDocument/2006/customXml" ds:itemID="{ED89375D-CDAB-456B-8629-1FB23ED587C7}">
+<ds:datastoreItem xmlns:ds="http://schemas.openxmlformats.org/officeDocument/2006/customXml" ds:itemID="{CFBF677E-CD2E-4F50-91BC-C9FA73C66AF4}">
   <ds:schemaRefs>
     <ds:schemaRef ds:uri="http://schemas.openxmlformats.org/officeDocument/2006/bibliography"/>
   </ds:schemaRefs>

</xml_diff>